<commit_message>
docs: nombres de integrantes (Gabriel Molina, Jefferson Rojas) y guion de video acortado a ~7 min
Co-Authored-By: Claude Opus 4.8 <noreply@anthropic.com>
Claude-Session: https://claude.ai/code/session_01RGSUNUR7x2rUumoScYtZwM
</commit_message>
<xml_diff>
--- a/docs/Guion-Video-EP3.docx
+++ b/docs/Guion-Video-EP3.docx
@@ -48,6 +48,24 @@
     </w:p>
     <w:p>
       <w:pPr>
+        <w:pStyle w:val="FirstParagraph"/>
+      </w:pPr>
+      <w:r>
+        <w:rPr>
+          <w:b/>
+          <w:bCs/>
+        </w:rPr>
+        <w:t xml:space="preserve">Integrantes:</w:t>
+      </w:r>
+      <w:r>
+        <w:t xml:space="preserve"> </w:t>
+      </w:r>
+      <w:r>
+        <w:t xml:space="preserve">Gabriel Molina · Jefferson Rojas</w:t>
+      </w:r>
+    </w:p>
+    <w:p>
+      <w:pPr>
         <w:pStyle w:val="BlockText"/>
       </w:pPr>
       <w:r>
@@ -117,7 +135,7 @@
         <w:t xml:space="preserve"> </w:t>
       </w:r>
       <w:r>
-        <w:t xml:space="preserve">(compartir pantalla y grabar) o</w:t>
+        <w:t xml:space="preserve">o</w:t>
       </w:r>
       <w:r>
         <w:t xml:space="preserve"> </w:t>
@@ -130,26 +148,23 @@
         <w:t xml:space="preserve">Loom</w:t>
       </w:r>
       <w:r>
-        <w:t xml:space="preserve">. Duración objetivo:</w:t>
-      </w:r>
-      <w:r>
-        <w:t xml:space="preserve"> </w:t>
-      </w:r>
-      <w:r>
-        <w:rPr>
-          <w:b/>
-          <w:bCs/>
-        </w:rPr>
-        <w:t xml:space="preserve">10–12 min</w:t>
-      </w:r>
-      <w:r>
         <w:t xml:space="preserve">.</w:t>
       </w:r>
       <w:r>
         <w:t xml:space="preserve"> </w:t>
       </w:r>
       <w:r>
-        <w:t xml:space="preserve">Se puede narrar mostrando las</w:t>
+        <w:rPr>
+          <w:b/>
+          <w:bCs/>
+        </w:rPr>
+        <w:t xml:space="preserve">Duración objetivo: ~7 minutos (máx. 8).</w:t>
+      </w:r>
+      <w:r>
+        <w:t xml:space="preserve"> </w:t>
+      </w:r>
+      <w:r>
+        <w:t xml:space="preserve">Se narra mostrando las</w:t>
       </w:r>
       <w:r>
         <w:t xml:space="preserve"> </w:t>
@@ -165,10 +180,7 @@
         <w:t xml:space="preserve"> </w:t>
       </w:r>
       <w:r>
-        <w:t xml:space="preserve">(carpeta</w:t>
-      </w:r>
-      <w:r>
-        <w:t xml:space="preserve"> </w:t>
+        <w:t xml:space="preserve">(</w:t>
       </w:r>
       <w:r>
         <w:rPr>
@@ -193,13 +205,7 @@
         <w:t xml:space="preserve"> </w:t>
       </w:r>
       <w:r>
-        <w:t xml:space="preserve">en</w:t>
-      </w:r>
-      <w:r>
-        <w:t xml:space="preserve"> </w:t>
-      </w:r>
-      <w:r>
-        <w:t xml:space="preserve">GitHub y la pestaña</w:t>
+        <w:t xml:space="preserve">y la pestaña</w:t>
       </w:r>
       <w:r>
         <w:t xml:space="preserve"> </w:t>
@@ -212,7 +218,7 @@
         <w:t xml:space="preserve">Actions</w:t>
       </w:r>
       <w:r>
-        <w:t xml:space="preserve">. No se requiere AWS en vivo.</w:t>
+        <w:t xml:space="preserve">. No requiere AWS en vivo.</w:t>
       </w:r>
     </w:p>
     <w:p>
@@ -230,13 +236,13 @@
         <w:t xml:space="preserve"> </w:t>
       </w:r>
       <w:r>
-        <w:t xml:space="preserve">aunque el encargo es en pareja, cada quien debe dominar TODO. Si graban</w:t>
-      </w:r>
-      <w:r>
-        <w:t xml:space="preserve"> </w:t>
-      </w:r>
-      <w:r>
-        <w:t xml:space="preserve">juntos, repártanse los segmentos, pero ambos deben poder explicar cualquier parte.</w:t>
+        <w:t xml:space="preserve">aunque el encargo es en pareja, cada uno debe dominar TODO. Si graban</w:t>
+      </w:r>
+      <w:r>
+        <w:t xml:space="preserve"> </w:t>
+      </w:r>
+      <w:r>
+        <w:t xml:space="preserve">juntos, repártanse segmentos, pero ambos deben poder explicar cualquier parte.</w:t>
       </w:r>
     </w:p>
     <w:p>
@@ -254,7 +260,17 @@
         <w:t xml:space="preserve"> </w:t>
       </w:r>
       <w:r>
-        <w:t xml:space="preserve">🖥️ = qué mostrar en pantalla · 🎙️ = qué decir (libreto).</w:t>
+        <w:t xml:space="preserve">🖥️ = qué mostrar · 🎙️ = qué decir.</w:t>
+      </w:r>
+      <w:r>
+        <w:t xml:space="preserve"> </w:t>
+      </w:r>
+      <w:r>
+        <w:rPr>
+          <w:i/>
+          <w:iCs/>
+        </w:rPr>
+        <w:t xml:space="preserve">(Tip: habla con tus palabras, no leas de corrido.)</w:t>
       </w:r>
     </w:p>
     <w:p>
@@ -264,13 +280,13 @@
         </w:pict>
       </w:r>
     </w:p>
-    <w:bookmarkStart w:id="9" w:name="segmento-0--portada-e-introducción--40-s"/>
+    <w:bookmarkStart w:id="9" w:name="segmento-0--introducción--30-s"/>
     <w:p>
       <w:pPr>
         <w:pStyle w:val="Heading3"/>
       </w:pPr>
       <w:r>
-        <w:t xml:space="preserve">Segmento 0 — Portada e introducción · ~40 s</w:t>
+        <w:t xml:space="preserve">Segmento 0 — Introducción · ~30 s</w:t>
       </w:r>
     </w:p>
     <w:p>
@@ -278,37 +294,48 @@
         <w:pStyle w:val="FirstParagraph"/>
       </w:pPr>
       <w:r>
-        <w:t xml:space="preserve">🖥️ Diapositiva de título / repositorio en GitHub (captura</w:t>
-      </w:r>
-      <w:r>
-        <w:t xml:space="preserve"> </w:t>
-      </w:r>
-      <w:r>
-        <w:rPr>
-          <w:rStyle w:val="VerbatimChar"/>
-        </w:rPr>
-        <w:t xml:space="preserve">img20</w:t>
-      </w:r>
-      <w:r>
-        <w:t xml:space="preserve">).</w:t>
-      </w:r>
-      <w:r>
-        <w:t xml:space="preserve"> </w:t>
-      </w:r>
-      <w:r>
-        <w:t xml:space="preserve">🎙️ "Hola, somos [nombre] y [nombre]. En este video explicamos cómo construimos e implementamos la</w:t>
-      </w:r>
-      <w:r>
-        <w:t xml:space="preserve"> </w:t>
-      </w:r>
-      <w:r>
-        <w:t xml:space="preserve">Evaluación Parcial 3 del ramo Introducción a Herramientas DevOps: una aplicación de 3 capas</w:t>
-      </w:r>
-      <w:r>
-        <w:t xml:space="preserve"> </w:t>
-      </w:r>
-      <w:r>
-        <w:t xml:space="preserve">llamada</w:t>
+        <w:t xml:space="preserve">🖥️ Diapositiva de título o repo en GitHub.</w:t>
+      </w:r>
+      <w:r>
+        <w:t xml:space="preserve"> </w:t>
+      </w:r>
+      <w:r>
+        <w:t xml:space="preserve">🎙️ "Hola, somos</w:t>
+      </w:r>
+      <w:r>
+        <w:t xml:space="preserve"> </w:t>
+      </w:r>
+      <w:r>
+        <w:rPr>
+          <w:b/>
+          <w:bCs/>
+        </w:rPr>
+        <w:t xml:space="preserve">Gabriel Molina</w:t>
+      </w:r>
+      <w:r>
+        <w:t xml:space="preserve"> </w:t>
+      </w:r>
+      <w:r>
+        <w:t xml:space="preserve">y</w:t>
+      </w:r>
+      <w:r>
+        <w:t xml:space="preserve"> </w:t>
+      </w:r>
+      <w:r>
+        <w:rPr>
+          <w:b/>
+          <w:bCs/>
+        </w:rPr>
+        <w:t xml:space="preserve">Jefferson Rojas</w:t>
+      </w:r>
+      <w:r>
+        <w:t xml:space="preserve">. En este video mostramos cómo</w:t>
+      </w:r>
+      <w:r>
+        <w:t xml:space="preserve"> </w:t>
+      </w:r>
+      <w:r>
+        <w:t xml:space="preserve">construimos la EP3: la aplicación</w:t>
       </w:r>
       <w:r>
         <w:t xml:space="preserve"> </w:t>
@@ -321,42 +348,50 @@
         <w:t xml:space="preserve">Tienda de Perritos</w:t>
       </w:r>
       <w:r>
-        <w:t xml:space="preserve">, orquestada en</w:t>
-      </w:r>
-      <w:r>
-        <w:t xml:space="preserve"> </w:t>
-      </w:r>
-      <w:r>
-        <w:rPr>
-          <w:b/>
-          <w:bCs/>
-        </w:rPr>
-        <w:t xml:space="preserve">AWS ECS Fargate</w:t>
-      </w:r>
-      <w:r>
-        <w:t xml:space="preserve"> </w:t>
-      </w:r>
-      <w:r>
-        <w:t xml:space="preserve">y con un pipeline de</w:t>
-      </w:r>
-      <w:r>
-        <w:t xml:space="preserve"> </w:t>
-      </w:r>
-      <w:r>
-        <w:rPr>
-          <w:b/>
-          <w:bCs/>
-        </w:rPr>
-        <w:t xml:space="preserve">CI/CD automatizado en GitHub Actions</w:t>
-      </w:r>
-      <w:r>
-        <w:t xml:space="preserve">. El caso es la empresa Innovatech Chile, que después de</w:t>
-      </w:r>
-      <w:r>
-        <w:t xml:space="preserve"> </w:t>
-      </w:r>
-      <w:r>
-        <w:t xml:space="preserve">contenedorizar su app, avanza hacia la orquestación productiva en la nube."</w:t>
+        <w:t xml:space="preserve">, de tres capas, orquestada en</w:t>
+      </w:r>
+      <w:r>
+        <w:t xml:space="preserve"> </w:t>
+      </w:r>
+      <w:r>
+        <w:rPr>
+          <w:b/>
+          <w:bCs/>
+        </w:rPr>
+        <w:t xml:space="preserve">AWS ECS</w:t>
+      </w:r>
+      <w:r>
+        <w:rPr>
+          <w:b/>
+          <w:bCs/>
+        </w:rPr>
+        <w:t xml:space="preserve"> </w:t>
+      </w:r>
+      <w:r>
+        <w:rPr>
+          <w:b/>
+          <w:bCs/>
+        </w:rPr>
+        <w:t xml:space="preserve">Fargate</w:t>
+      </w:r>
+      <w:r>
+        <w:t xml:space="preserve"> </w:t>
+      </w:r>
+      <w:r>
+        <w:t xml:space="preserve">con</w:t>
+      </w:r>
+      <w:r>
+        <w:t xml:space="preserve"> </w:t>
+      </w:r>
+      <w:r>
+        <w:rPr>
+          <w:b/>
+          <w:bCs/>
+        </w:rPr>
+        <w:t xml:space="preserve">CI/CD en GitHub Actions</w:t>
+      </w:r>
+      <w:r>
+        <w:t xml:space="preserve">, para el caso de Innovatech Chile."</w:t>
       </w:r>
     </w:p>
     <w:p>
@@ -367,13 +402,13 @@
       </w:r>
     </w:p>
     <w:bookmarkEnd w:id="9"/>
-    <w:bookmarkStart w:id="10" w:name="Xda1290f809478b8893d3b9aa231f9d461b670fd"/>
+    <w:bookmarkStart w:id="10" w:name="Xb3d6ef41703dcd23d8c3205d33855a2e1bd153c"/>
     <w:p>
       <w:pPr>
         <w:pStyle w:val="Heading3"/>
       </w:pPr>
       <w:r>
-        <w:t xml:space="preserve">Segmento 1 — La aplicación y su contenedorización · ~1 min</w:t>
+        <w:t xml:space="preserve">Segmento 1 — La app y su contenedorización · ~40 s</w:t>
       </w:r>
     </w:p>
     <w:p>
@@ -381,7 +416,7 @@
         <w:pStyle w:val="FirstParagraph"/>
       </w:pPr>
       <w:r>
-        <w:t xml:space="preserve">🖥️ La app en el navegador (</w:t>
+        <w:t xml:space="preserve">🖥️ App en el navegador (</w:t>
       </w:r>
       <w:r>
         <w:rPr>
@@ -390,48 +425,12 @@
         <w:t xml:space="preserve">ie2-app-navegador.png</w:t>
       </w:r>
       <w:r>
-        <w:t xml:space="preserve">) → luego el repo (carpetas</w:t>
-      </w:r>
-      <w:r>
-        <w:t xml:space="preserve"> </w:t>
+        <w:t xml:space="preserve">) → ECR (</w:t>
       </w:r>
       <w:r>
         <w:rPr>
           <w:rStyle w:val="VerbatimChar"/>
         </w:rPr>
-        <w:t xml:space="preserve">frontend/</w:t>
-      </w:r>
-      <w:r>
-        <w:t xml:space="preserve">,</w:t>
-      </w:r>
-      <w:r>
-        <w:t xml:space="preserve"> </w:t>
-      </w:r>
-      <w:r>
-        <w:rPr>
-          <w:rStyle w:val="VerbatimChar"/>
-        </w:rPr>
-        <w:t xml:space="preserve">backend/</w:t>
-      </w:r>
-      <w:r>
-        <w:t xml:space="preserve">,</w:t>
-      </w:r>
-      <w:r>
-        <w:t xml:space="preserve"> </w:t>
-      </w:r>
-      <w:r>
-        <w:rPr>
-          <w:rStyle w:val="VerbatimChar"/>
-        </w:rPr>
-        <w:t xml:space="preserve">db/</w:t>
-      </w:r>
-      <w:r>
-        <w:t xml:space="preserve">) → ECR (</w:t>
-      </w:r>
-      <w:r>
-        <w:rPr>
-          <w:rStyle w:val="VerbatimChar"/>
-        </w:rPr>
         <w:t xml:space="preserve">ie2-ecr-repos.png</w:t>
       </w:r>
       <w:r>
@@ -441,7 +440,7 @@
         <w:t xml:space="preserve"> </w:t>
       </w:r>
       <w:r>
-        <w:t xml:space="preserve">🎙️ "La aplicación es un CRUD de productos con tres capas: un</w:t>
+        <w:t xml:space="preserve">🎙️ "La aplicación es un CRUD de productos con tres capas:</w:t>
       </w:r>
       <w:r>
         <w:t xml:space="preserve"> </w:t>
@@ -457,13 +456,7 @@
         <w:t xml:space="preserve"> </w:t>
       </w:r>
       <w:r>
-        <w:t xml:space="preserve">en nginx que sirve el</w:t>
-      </w:r>
-      <w:r>
-        <w:t xml:space="preserve"> </w:t>
-      </w:r>
-      <w:r>
-        <w:t xml:space="preserve">HTML y JavaScript, un</w:t>
+        <w:t xml:space="preserve">en nginx,</w:t>
       </w:r>
       <w:r>
         <w:t xml:space="preserve"> </w:t>
@@ -479,13 +472,13 @@
         <w:t xml:space="preserve"> </w:t>
       </w:r>
       <w:r>
-        <w:t xml:space="preserve">en Node.js con Express que expone una API REST, y una base de</w:t>
-      </w:r>
-      <w:r>
-        <w:t xml:space="preserve"> </w:t>
-      </w:r>
-      <w:r>
-        <w:t xml:space="preserve">datos</w:t>
+        <w:t xml:space="preserve">en</w:t>
+      </w:r>
+      <w:r>
+        <w:t xml:space="preserve"> </w:t>
+      </w:r>
+      <w:r>
+        <w:t xml:space="preserve">Node.js con Express y base de datos</w:t>
       </w:r>
       <w:r>
         <w:t xml:space="preserve"> </w:t>
@@ -498,26 +491,13 @@
         <w:t xml:space="preserve">MySQL</w:t>
       </w:r>
       <w:r>
-        <w:t xml:space="preserve">. Cada capa tiene su propio</w:t>
-      </w:r>
-      <w:r>
-        <w:t xml:space="preserve"> </w:t>
-      </w:r>
-      <w:r>
-        <w:rPr>
-          <w:b/>
-          <w:bCs/>
-        </w:rPr>
-        <w:t xml:space="preserve">Dockerfile</w:t>
-      </w:r>
-      <w:r>
-        <w:t xml:space="preserve">, así que la empaquetamos como tres</w:t>
-      </w:r>
-      <w:r>
-        <w:t xml:space="preserve"> </w:t>
-      </w:r>
-      <w:r>
-        <w:t xml:space="preserve">imágenes de contenedor. Esas imágenes las subimos a</w:t>
+        <w:t xml:space="preserve">. Cada capa tiene su Dockerfile; las empaquetamos como</w:t>
+      </w:r>
+      <w:r>
+        <w:t xml:space="preserve"> </w:t>
+      </w:r>
+      <w:r>
+        <w:t xml:space="preserve">imágenes y las subimos a</w:t>
       </w:r>
       <w:r>
         <w:t xml:space="preserve"> </w:t>
@@ -530,52 +510,13 @@
         <w:t xml:space="preserve">Amazon ECR</w:t>
       </w:r>
       <w:r>
-        <w:t xml:space="preserve">, que es el registro privado de</w:t>
-      </w:r>
-      <w:r>
-        <w:t xml:space="preserve"> </w:t>
-      </w:r>
-      <w:r>
-        <w:t xml:space="preserve">imágenes de AWS: aquí están los tres repositorios,</w:t>
-      </w:r>
-      <w:r>
-        <w:t xml:space="preserve"> </w:t>
-      </w:r>
-      <w:r>
-        <w:rPr>
-          <w:rStyle w:val="VerbatimChar"/>
-        </w:rPr>
-        <w:t xml:space="preserve">tienda-frontend</w:t>
-      </w:r>
-      <w:r>
-        <w:t xml:space="preserve">,</w:t>
-      </w:r>
-      <w:r>
-        <w:t xml:space="preserve"> </w:t>
-      </w:r>
-      <w:r>
-        <w:rPr>
-          <w:rStyle w:val="VerbatimChar"/>
-        </w:rPr>
-        <w:t xml:space="preserve">tienda-backend</w:t>
-      </w:r>
-      <w:r>
-        <w:t xml:space="preserve"> </w:t>
-      </w:r>
-      <w:r>
-        <w:t xml:space="preserve">y</w:t>
-      </w:r>
-      <w:r>
-        <w:t xml:space="preserve"> </w:t>
-      </w:r>
-      <w:r>
-        <w:rPr>
-          <w:rStyle w:val="VerbatimChar"/>
-        </w:rPr>
-        <w:t xml:space="preserve">tienda-db</w:t>
-      </w:r>
-      <w:r>
-        <w:t xml:space="preserve">. ECR es la fuente desde donde el clúster va a descargar las imágenes."</w:t>
+        <w:t xml:space="preserve">, el registro privado de AWS desde donde el clúster las</w:t>
+      </w:r>
+      <w:r>
+        <w:t xml:space="preserve"> </w:t>
+      </w:r>
+      <w:r>
+        <w:t xml:space="preserve">descarga."</w:t>
       </w:r>
     </w:p>
     <w:p>
@@ -586,13 +527,13 @@
       </w:r>
     </w:p>
     <w:bookmarkEnd w:id="10"/>
-    <w:bookmarkStart w:id="11" w:name="X4653a4cac90b1486798c094b4f4f0904ce43aa7"/>
+    <w:bookmarkStart w:id="11" w:name="segmento-2--clúster-ecs-fargate--40-s"/>
     <w:p>
       <w:pPr>
         <w:pStyle w:val="Heading3"/>
       </w:pPr>
       <w:r>
-        <w:t xml:space="preserve">Segmento 2 — El clúster ECS Fargate y por qué lo elegimos · ~1 min 15 s</w:t>
+        <w:t xml:space="preserve">Segmento 2 — Clúster ECS Fargate · ~40 s</w:t>
       </w:r>
     </w:p>
     <w:p>
@@ -600,7 +541,7 @@
         <w:pStyle w:val="FirstParagraph"/>
       </w:pPr>
       <w:r>
-        <w:t xml:space="preserve">🖥️ Clúster con los servicios (</w:t>
+        <w:t xml:space="preserve">🖥️ Clúster con servicios (</w:t>
       </w:r>
       <w:r>
         <w:rPr>
@@ -609,38 +550,63 @@
         <w:t xml:space="preserve">ie1-cluster-servicios.png</w:t>
       </w:r>
       <w:r>
-        <w:t xml:space="preserve">) → tareas en ejecución (</w:t>
+        <w:t xml:space="preserve">).</w:t>
+      </w:r>
+      <w:r>
+        <w:t xml:space="preserve"> </w:t>
+      </w:r>
+      <w:r>
+        <w:t xml:space="preserve">🎙️ "Para orquestar usamos un clúster</w:t>
+      </w:r>
+      <w:r>
+        <w:t xml:space="preserve"> </w:t>
+      </w:r>
+      <w:r>
+        <w:rPr>
+          <w:b/>
+          <w:bCs/>
+        </w:rPr>
+        <w:t xml:space="preserve">ECS en modo Fargate</w:t>
+      </w:r>
+      <w:r>
+        <w:t xml:space="preserve">, que es</w:t>
+      </w:r>
+      <w:r>
+        <w:t xml:space="preserve"> </w:t>
+      </w:r>
+      <w:r>
+        <w:rPr>
+          <w:i/>
+          <w:iCs/>
+        </w:rPr>
+        <w:t xml:space="preserve">serverless</w:t>
+      </w:r>
+      <w:r>
+        <w:t xml:space="preserve">: no</w:t>
+      </w:r>
+      <w:r>
+        <w:t xml:space="preserve"> </w:t>
+      </w:r>
+      <w:r>
+        <w:t xml:space="preserve">administramos servidores. Elegimos Fargate y no EKS porque el laboratorio de AWS Academy no permite</w:t>
+      </w:r>
+      <w:r>
+        <w:t xml:space="preserve"> </w:t>
+      </w:r>
+      <w:r>
+        <w:t xml:space="preserve">crear roles IAM ni usar</w:t>
+      </w:r>
+      <w:r>
+        <w:t xml:space="preserve"> </w:t>
       </w:r>
       <w:r>
         <w:rPr>
           <w:rStyle w:val="VerbatimChar"/>
         </w:rPr>
-        <w:t xml:space="preserve">img02</w:t>
-      </w:r>
-      <w:r>
-        <w:t xml:space="preserve">).</w:t>
-      </w:r>
-      <w:r>
-        <w:t xml:space="preserve"> </w:t>
-      </w:r>
-      <w:r>
-        <w:t xml:space="preserve">🎙️ "Para orquestar los contenedores creamos un</w:t>
-      </w:r>
-      <w:r>
-        <w:t xml:space="preserve"> </w:t>
-      </w:r>
-      <w:r>
-        <w:rPr>
-          <w:b/>
-          <w:bCs/>
-        </w:rPr>
-        <w:t xml:space="preserve">clúster de ECS</w:t>
-      </w:r>
-      <w:r>
-        <w:t xml:space="preserve"> </w:t>
-      </w:r>
-      <w:r>
-        <w:t xml:space="preserve">llamado</w:t>
+        <w:t xml:space="preserve">eksctl</w:t>
+      </w:r>
+      <w:r>
+        <w:t xml:space="preserve">; Fargate reutiliza el rol</w:t>
       </w:r>
       <w:r>
         <w:t xml:space="preserve"> </w:t>
@@ -649,160 +615,23 @@
         <w:rPr>
           <w:rStyle w:val="VerbatimChar"/>
         </w:rPr>
-        <w:t xml:space="preserve">tienda-cluster</w:t>
-      </w:r>
-      <w:r>
-        <w:t xml:space="preserve">, en</w:t>
-      </w:r>
-      <w:r>
-        <w:t xml:space="preserve"> </w:t>
-      </w:r>
-      <w:r>
-        <w:t xml:space="preserve">modo</w:t>
-      </w:r>
-      <w:r>
-        <w:t xml:space="preserve"> </w:t>
-      </w:r>
-      <w:r>
-        <w:rPr>
-          <w:b/>
-          <w:bCs/>
-        </w:rPr>
-        <w:t xml:space="preserve">Fargate</w:t>
-      </w:r>
-      <w:r>
-        <w:t xml:space="preserve">. Elegimos Fargate y no EKS por dos razones: primero, es</w:t>
-      </w:r>
-      <w:r>
-        <w:t xml:space="preserve"> </w:t>
-      </w:r>
-      <w:r>
-        <w:rPr>
-          <w:b/>
-          <w:bCs/>
-        </w:rPr>
-        <w:t xml:space="preserve">serverless</w:t>
-      </w:r>
-      <w:r>
-        <w:t xml:space="preserve">, o sea no</w:t>
-      </w:r>
-      <w:r>
-        <w:t xml:space="preserve"> </w:t>
-      </w:r>
-      <w:r>
-        <w:t xml:space="preserve">tenemos que administrar servidores EC2; y segundo, en el laboratorio de AWS Academy</w:t>
-      </w:r>
-      <w:r>
-        <w:t xml:space="preserve"> </w:t>
-      </w:r>
-      <w:r>
-        <w:rPr>
-          <w:b/>
-          <w:bCs/>
-        </w:rPr>
-        <w:t xml:space="preserve">no se pueden</w:t>
-      </w:r>
-      <w:r>
-        <w:rPr>
-          <w:b/>
-          <w:bCs/>
-        </w:rPr>
-        <w:t xml:space="preserve"> </w:t>
-      </w:r>
-      <w:r>
-        <w:rPr>
-          <w:b/>
-          <w:bCs/>
-        </w:rPr>
-        <w:t xml:space="preserve">crear roles de IAM nuevos</w:t>
-      </w:r>
-      <w:r>
-        <w:t xml:space="preserve"> </w:t>
-      </w:r>
-      <w:r>
-        <w:t xml:space="preserve">ni usar herramientas como</w:t>
-      </w:r>
-      <w:r>
-        <w:t xml:space="preserve"> </w:t>
-      </w:r>
-      <w:r>
-        <w:rPr>
-          <w:rStyle w:val="VerbatimChar"/>
-        </w:rPr>
-        <w:t xml:space="preserve">eksctl</w:t>
-      </w:r>
-      <w:r>
-        <w:t xml:space="preserve">, así que Fargate, que reutiliza el</w:t>
-      </w:r>
-      <w:r>
-        <w:t xml:space="preserve"> </w:t>
-      </w:r>
-      <w:r>
-        <w:t xml:space="preserve">rol preexistente</w:t>
-      </w:r>
-      <w:r>
-        <w:t xml:space="preserve"> </w:t>
-      </w:r>
-      <w:r>
-        <w:rPr>
-          <w:rStyle w:val="VerbatimChar"/>
-        </w:rPr>
         <w:t xml:space="preserve">LabRole</w:t>
       </w:r>
       <w:r>
-        <w:t xml:space="preserve">, era la opción viable. Aquí vemos el clúster con sus</w:t>
-      </w:r>
-      <w:r>
-        <w:t xml:space="preserve"> </w:t>
-      </w:r>
-      <w:r>
-        <w:rPr>
-          <w:b/>
-          <w:bCs/>
-        </w:rPr>
-        <w:t xml:space="preserve">tres servicios</w:t>
-      </w:r>
-      <w:r>
-        <w:rPr>
-          <w:b/>
-          <w:bCs/>
-        </w:rPr>
-        <w:t xml:space="preserve"> </w:t>
-      </w:r>
-      <w:r>
-        <w:rPr>
-          <w:b/>
-          <w:bCs/>
-        </w:rPr>
-        <w:t xml:space="preserve">activos</w:t>
-      </w:r>
-      <w:r>
-        <w:t xml:space="preserve"> </w:t>
-      </w:r>
-      <w:r>
-        <w:t xml:space="preserve">—frontend, backend y base de datos— y las</w:t>
-      </w:r>
-      <w:r>
-        <w:t xml:space="preserve"> </w:t>
-      </w:r>
-      <w:r>
-        <w:rPr>
-          <w:b/>
-          <w:bCs/>
-        </w:rPr>
-        <w:t xml:space="preserve">tareas corriendo</w:t>
-      </w:r>
-      <w:r>
-        <w:t xml:space="preserve"> </w:t>
-      </w:r>
-      <w:r>
-        <w:t xml:space="preserve">en Fargate. Cada servicio</w:t>
-      </w:r>
-      <w:r>
-        <w:t xml:space="preserve"> </w:t>
-      </w:r>
-      <w:r>
-        <w:t xml:space="preserve">mantiene viva una cantidad de tareas y las reemplaza solas si se caen."</w:t>
+        <w:t xml:space="preserve">. Aquí está el clúster con sus</w:t>
+      </w:r>
+      <w:r>
+        <w:t xml:space="preserve"> </w:t>
+      </w:r>
+      <w:r>
+        <w:rPr>
+          <w:b/>
+          <w:bCs/>
+        </w:rPr>
+        <w:t xml:space="preserve">tres servicios activos</w:t>
+      </w:r>
+      <w:r>
+        <w:t xml:space="preserve">, y cada servicio repone solo las tareas que se caen."</w:t>
       </w:r>
     </w:p>
     <w:p>
@@ -813,13 +642,13 @@
       </w:r>
     </w:p>
     <w:bookmarkEnd w:id="11"/>
-    <w:bookmarkStart w:id="12" w:name="X3544274c6a626d5b1d487c25ec5bdd06d91ecad"/>
+    <w:bookmarkStart w:id="12" w:name="X1d14f3b9025837714c43e85931a6243410aa648"/>
     <w:p>
       <w:pPr>
         <w:pStyle w:val="Heading3"/>
       </w:pPr>
       <w:r>
-        <w:t xml:space="preserve">Segmento 3 — Redes, balanceadores y seguridad · ~1 min 30 s</w:t>
+        <w:t xml:space="preserve">Segmento 3 — Redes, balanceadores y seguridad · ~55 s</w:t>
       </w:r>
     </w:p>
     <w:p>
@@ -836,7 +665,7 @@
         <w:t xml:space="preserve">img08</w:t>
       </w:r>
       <w:r>
-        <w:t xml:space="preserve">) → regla del listener (</w:t>
+        <w:t xml:space="preserve">) → regla de ruta (</w:t>
       </w:r>
       <w:r>
         <w:rPr>
@@ -845,7 +674,7 @@
         <w:t xml:space="preserve">ie2-alb-routing.png</w:t>
       </w:r>
       <w:r>
-        <w:t xml:space="preserve">) → SG ecs</w:t>
+        <w:t xml:space="preserve">) → Security Groups</w:t>
       </w:r>
       <w:r>
         <w:t xml:space="preserve"> </w:t>
@@ -860,7 +689,10 @@
         <w:t xml:space="preserve">ie1-sg-ecs.png</w:t>
       </w:r>
       <w:r>
-        <w:t xml:space="preserve">) → SG alb (</w:t>
+        <w:t xml:space="preserve">,</w:t>
+      </w:r>
+      <w:r>
+        <w:t xml:space="preserve"> </w:t>
       </w:r>
       <w:r>
         <w:rPr>
@@ -875,50 +707,26 @@
         <w:t xml:space="preserve"> </w:t>
       </w:r>
       <w:r>
-        <w:t xml:space="preserve">🎙️ "La comunicación fue el punto más interesante. Como el laboratorio</w:t>
-      </w:r>
-      <w:r>
-        <w:t xml:space="preserve"> </w:t>
-      </w:r>
-      <w:r>
-        <w:rPr>
-          <w:b/>
-          <w:bCs/>
-        </w:rPr>
-        <w:t xml:space="preserve">deniega el descubrimiento</w:t>
-      </w:r>
-      <w:r>
-        <w:rPr>
-          <w:b/>
-          <w:bCs/>
-        </w:rPr>
-        <w:t xml:space="preserve"> </w:t>
-      </w:r>
-      <w:r>
-        <w:rPr>
-          <w:b/>
-          <w:bCs/>
-        </w:rPr>
-        <w:t xml:space="preserve">de servicios</w:t>
-      </w:r>
-      <w:r>
-        <w:t xml:space="preserve"> </w:t>
-      </w:r>
-      <w:r>
-        <w:t xml:space="preserve">(Cloud Map), resolvimos todo con</w:t>
-      </w:r>
-      <w:r>
-        <w:t xml:space="preserve"> </w:t>
-      </w:r>
-      <w:r>
-        <w:rPr>
-          <w:b/>
-          <w:bCs/>
-        </w:rPr>
-        <w:t xml:space="preserve">balanceadores de carga</w:t>
-      </w:r>
-      <w:r>
-        <w:t xml:space="preserve">. Tenemos un</w:t>
+        <w:t xml:space="preserve">🎙️ "La comunicación la resolvimos con</w:t>
+      </w:r>
+      <w:r>
+        <w:t xml:space="preserve"> </w:t>
+      </w:r>
+      <w:r>
+        <w:rPr>
+          <w:b/>
+          <w:bCs/>
+        </w:rPr>
+        <w:t xml:space="preserve">balanceadores</w:t>
+      </w:r>
+      <w:r>
+        <w:t xml:space="preserve">, porque el lab deniega el descubrimiento</w:t>
+      </w:r>
+      <w:r>
+        <w:t xml:space="preserve"> </w:t>
+      </w:r>
+      <w:r>
+        <w:t xml:space="preserve">de servicios. Un</w:t>
       </w:r>
       <w:r>
         <w:t xml:space="preserve"> </w:t>
@@ -931,43 +739,10 @@
         <w:t xml:space="preserve">ALB</w:t>
       </w:r>
       <w:r>
-        <w:t xml:space="preserve">, que</w:t>
-      </w:r>
-      <w:r>
-        <w:t xml:space="preserve"> </w:t>
-      </w:r>
-      <w:r>
-        <w:t xml:space="preserve">es un balanceador de capa 7 (HTTP), público: el navegador entra por él, y mediante una</w:t>
-      </w:r>
-      <w:r>
-        <w:t xml:space="preserve"> </w:t>
-      </w:r>
-      <w:r>
-        <w:rPr>
-          <w:b/>
-          <w:bCs/>
-        </w:rPr>
-        <w:t xml:space="preserve">regla de</w:t>
-      </w:r>
-      <w:r>
-        <w:rPr>
-          <w:b/>
-          <w:bCs/>
-        </w:rPr>
-        <w:t xml:space="preserve"> </w:t>
-      </w:r>
-      <w:r>
-        <w:rPr>
-          <w:b/>
-          <w:bCs/>
-        </w:rPr>
-        <w:t xml:space="preserve">ruta</w:t>
-      </w:r>
-      <w:r>
-        <w:t xml:space="preserve"> </w:t>
-      </w:r>
-      <w:r>
-        <w:t xml:space="preserve">lo que va a</w:t>
+        <w:t xml:space="preserve"> </w:t>
+      </w:r>
+      <w:r>
+        <w:t xml:space="preserve">público enruta por ruta: lo que va a</w:t>
       </w:r>
       <w:r>
         <w:t xml:space="preserve"> </w:t>
@@ -982,38 +757,40 @@
         <w:t xml:space="preserve"> </w:t>
       </w:r>
       <w:r>
-        <w:t xml:space="preserve">se enruta al backend y el resto al frontend. Así el frontend nunca</w:t>
-      </w:r>
-      <w:r>
-        <w:t xml:space="preserve"> </w:t>
-      </w:r>
-      <w:r>
-        <w:t xml:space="preserve">necesita saber la IP del backend. Para la base de datos usamos un</w:t>
-      </w:r>
-      <w:r>
-        <w:t xml:space="preserve"> </w:t>
-      </w:r>
-      <w:r>
-        <w:rPr>
-          <w:b/>
-          <w:bCs/>
-        </w:rPr>
-        <w:t xml:space="preserve">NLB interno</w:t>
-      </w:r>
-      <w:r>
-        <w:t xml:space="preserve">, de capa 4 (TCP),</w:t>
-      </w:r>
-      <w:r>
-        <w:t xml:space="preserve"> </w:t>
-      </w:r>
-      <w:r>
-        <w:t xml:space="preserve">porque MySQL no es HTTP: el backend le habla por el puerto 3306 a través de un DNS estable. En</w:t>
-      </w:r>
-      <w:r>
-        <w:t xml:space="preserve"> </w:t>
-      </w:r>
-      <w:r>
-        <w:t xml:space="preserve">cuanto a seguridad, tenemos dos</w:t>
+        <w:t xml:space="preserve">lo manda al backend y el</w:t>
+      </w:r>
+      <w:r>
+        <w:t xml:space="preserve"> </w:t>
+      </w:r>
+      <w:r>
+        <w:t xml:space="preserve">resto al frontend, así el front no necesita la IP del back. Para la base de datos usamos un</w:t>
+      </w:r>
+      <w:r>
+        <w:t xml:space="preserve"> </w:t>
+      </w:r>
+      <w:r>
+        <w:rPr>
+          <w:b/>
+          <w:bCs/>
+        </w:rPr>
+        <w:t xml:space="preserve">NLB</w:t>
+      </w:r>
+      <w:r>
+        <w:rPr>
+          <w:b/>
+          <w:bCs/>
+        </w:rPr>
+        <w:t xml:space="preserve"> </w:t>
+      </w:r>
+      <w:r>
+        <w:rPr>
+          <w:b/>
+          <w:bCs/>
+        </w:rPr>
+        <w:t xml:space="preserve">interno</w:t>
+      </w:r>
+      <w:r>
+        <w:t xml:space="preserve">, porque MySQL es TCP. En seguridad, dos</w:t>
       </w:r>
       <w:r>
         <w:t xml:space="preserve"> </w:t>
@@ -1026,19 +803,19 @@
         <w:t xml:space="preserve">Security Groups</w:t>
       </w:r>
       <w:r>
-        <w:t xml:space="preserve">: el del ALB solo abre el puerto 80 a Internet,</w:t>
-      </w:r>
-      <w:r>
-        <w:t xml:space="preserve"> </w:t>
-      </w:r>
-      <w:r>
-        <w:t xml:space="preserve">y el de las tareas solo acepta tráfico desde el ALB y el 3306 dentro de la VPC, así la base de</w:t>
-      </w:r>
-      <w:r>
-        <w:t xml:space="preserve"> </w:t>
-      </w:r>
-      <w:r>
-        <w:t xml:space="preserve">datos</w:t>
+        <w:t xml:space="preserve">: el del ALB solo abre el</w:t>
+      </w:r>
+      <w:r>
+        <w:t xml:space="preserve"> </w:t>
+      </w:r>
+      <w:r>
+        <w:t xml:space="preserve">puerto 80 a Internet, y el de las tareas solo acepta tráfico desde el ALB y el 3306 dentro de la</w:t>
+      </w:r>
+      <w:r>
+        <w:t xml:space="preserve"> </w:t>
+      </w:r>
+      <w:r>
+        <w:t xml:space="preserve">VPC, así la base de datos</w:t>
       </w:r>
       <w:r>
         <w:t xml:space="preserve"> </w:t>
@@ -1051,10 +828,7 @@
         <w:t xml:space="preserve">nunca queda expuesta</w:t>
       </w:r>
       <w:r>
-        <w:t xml:space="preserve"> </w:t>
-      </w:r>
-      <w:r>
-        <w:t xml:space="preserve">a Internet."</w:t>
+        <w:t xml:space="preserve">."</w:t>
       </w:r>
     </w:p>
     <w:p>
@@ -1065,13 +839,13 @@
       </w:r>
     </w:p>
     <w:bookmarkEnd w:id="12"/>
-    <w:bookmarkStart w:id="13" w:name="X3e7712a106f65edccf0cb7ca535b28a39646abc"/>
+    <w:bookmarkStart w:id="13" w:name="X98cd95ab2fd31db5afe19015aeaf48b15d04cf4"/>
     <w:p>
       <w:pPr>
         <w:pStyle w:val="Heading3"/>
       </w:pPr>
       <w:r>
-        <w:t xml:space="preserve">Segmento 4 — Task Definitions y variables/secrets · ~1 min 15 s</w:t>
+        <w:t xml:space="preserve">Segmento 4 — Task Definitions y secrets · ~45 s</w:t>
       </w:r>
     </w:p>
     <w:p>
@@ -1079,7 +853,7 @@
         <w:pStyle w:val="FirstParagraph"/>
       </w:pPr>
       <w:r>
-        <w:t xml:space="preserve">🖥️ Task definition del backend (</w:t>
+        <w:t xml:space="preserve">🖥️ Task definition (</w:t>
       </w:r>
       <w:r>
         <w:rPr>
@@ -1116,59 +890,42 @@
         <w:t xml:space="preserve">Task Definition</w:t>
       </w:r>
       <w:r>
-        <w:t xml:space="preserve">: qué imagen usar de ECR, cuánta CPU y</w:t>
-      </w:r>
-      <w:r>
-        <w:t xml:space="preserve"> </w:t>
-      </w:r>
-      <w:r>
-        <w:t xml:space="preserve">memoria, los puertos, las variables de entorno y los secrets. Por ejemplo, el backend recibe el</w:t>
-      </w:r>
-      <w:r>
-        <w:t xml:space="preserve"> </w:t>
-      </w:r>
-      <w:r>
-        <w:t xml:space="preserve">host de la base de datos, el usuario y el nombre de la base como variables, y la</w:t>
-      </w:r>
-      <w:r>
-        <w:t xml:space="preserve"> </w:t>
-      </w:r>
-      <w:r>
-        <w:rPr>
-          <w:b/>
-          <w:bCs/>
-        </w:rPr>
-        <w:t xml:space="preserve">contraseña la</w:t>
-      </w:r>
-      <w:r>
-        <w:rPr>
-          <w:b/>
-          <w:bCs/>
-        </w:rPr>
-        <w:t xml:space="preserve"> </w:t>
-      </w:r>
-      <w:r>
-        <w:rPr>
-          <w:b/>
-          <w:bCs/>
-        </w:rPr>
-        <w:t xml:space="preserve">recibe como secret</w:t>
-      </w:r>
-      <w:r>
-        <w:t xml:space="preserve">. La contraseña no está escrita en ningún lado del código: vive cifrada en</w:t>
-      </w:r>
-      <w:r>
-        <w:t xml:space="preserve"> </w:t>
-      </w:r>
-      <w:r>
-        <w:rPr>
-          <w:b/>
-          <w:bCs/>
-        </w:rPr>
-        <w:t xml:space="preserve">AWS Systems Manager Parameter Store</w:t>
-      </w:r>
-      <w:r>
-        <w:t xml:space="preserve">, como un</w:t>
+        <w:t xml:space="preserve">: imagen de ECR, CPU, memoria, puertos,</w:t>
+      </w:r>
+      <w:r>
+        <w:t xml:space="preserve"> </w:t>
+      </w:r>
+      <w:r>
+        <w:t xml:space="preserve">variables y secrets. El backend recibe como variables el host, usuario y nombre de la base; la</w:t>
+      </w:r>
+      <w:r>
+        <w:t xml:space="preserve"> </w:t>
+      </w:r>
+      <w:r>
+        <w:rPr>
+          <w:b/>
+          <w:bCs/>
+        </w:rPr>
+        <w:t xml:space="preserve">contraseña no está en el código</w:t>
+      </w:r>
+      <w:r>
+        <w:t xml:space="preserve">: vive cifrada en</w:t>
+      </w:r>
+      <w:r>
+        <w:t xml:space="preserve"> </w:t>
+      </w:r>
+      <w:r>
+        <w:rPr>
+          <w:b/>
+          <w:bCs/>
+        </w:rPr>
+        <w:t xml:space="preserve">SSM Parameter Store</w:t>
+      </w:r>
+      <w:r>
+        <w:t xml:space="preserve"> </w:t>
+      </w:r>
+      <w:r>
+        <w:t xml:space="preserve">como</w:t>
       </w:r>
       <w:r>
         <w:t xml:space="preserve"> </w:t>
@@ -1181,13 +938,16 @@
         <w:t xml:space="preserve">SecureString</w:t>
       </w:r>
       <w:r>
-        <w:t xml:space="preserve">, y se inyecta al contenedor solo</w:t>
-      </w:r>
-      <w:r>
-        <w:t xml:space="preserve"> </w:t>
-      </w:r>
-      <w:r>
-        <w:t xml:space="preserve">en tiempo de ejecución. Esto es clave para la seguridad: nada de credenciales en el repositorio."</w:t>
+        <w:t xml:space="preserve"> </w:t>
+      </w:r>
+      <w:r>
+        <w:t xml:space="preserve">y</w:t>
+      </w:r>
+      <w:r>
+        <w:t xml:space="preserve"> </w:t>
+      </w:r>
+      <w:r>
+        <w:t xml:space="preserve">se inyecta al contenedor solo en ejecución."</w:t>
       </w:r>
     </w:p>
     <w:p>
@@ -1198,13 +958,13 @@
       </w:r>
     </w:p>
     <w:bookmarkEnd w:id="13"/>
-    <w:bookmarkStart w:id="14" w:name="X6e356016e6c8ae6b1b648b7b448e3e9e3555757"/>
+    <w:bookmarkStart w:id="14" w:name="X2ab15a96e20fb54e4e31a5bc4b22f1d80858a47"/>
     <w:p>
       <w:pPr>
         <w:pStyle w:val="Heading3"/>
       </w:pPr>
       <w:r>
-        <w:t xml:space="preserve">Segmento 5 — El pipeline CI/CD en GitHub Actions (el corazón) · ~2 min</w:t>
+        <w:t xml:space="preserve">Segmento 5 — Pipeline CI/CD (lo central) · ~1 min 20 s</w:t>
       </w:r>
     </w:p>
     <w:p>
@@ -1212,7 +972,7 @@
         <w:pStyle w:val="FirstParagraph"/>
       </w:pPr>
       <w:r>
-        <w:t xml:space="preserve">🖥️ El archivo</w:t>
+        <w:t xml:space="preserve">🖥️ Archivo</w:t>
       </w:r>
       <w:r>
         <w:t xml:space="preserve"> </w:t>
@@ -1227,29 +987,7 @@
         <w:t xml:space="preserve"> </w:t>
       </w:r>
       <w:r>
-        <w:t xml:space="preserve">en el repo → la pestaña</w:t>
-      </w:r>
-      <w:r>
-        <w:t xml:space="preserve"> </w:t>
-      </w:r>
-      <w:r>
-        <w:rPr>
-          <w:b/>
-          <w:bCs/>
-        </w:rPr>
-        <w:t xml:space="preserve">Actions</w:t>
-      </w:r>
-      <w:r>
-        <w:t xml:space="preserve"> </w:t>
-      </w:r>
-      <w:r>
-        <w:t xml:space="preserve">con el run en</w:t>
-      </w:r>
-      <w:r>
-        <w:t xml:space="preserve"> </w:t>
-      </w:r>
-      <w:r>
-        <w:t xml:space="preserve">verde (</w:t>
+        <w:t xml:space="preserve">→ run en verde (</w:t>
       </w:r>
       <w:r>
         <w:rPr>
@@ -1258,7 +996,13 @@
         <w:t xml:space="preserve">ie4-pipeline-verde.png</w:t>
       </w:r>
       <w:r>
-        <w:t xml:space="preserve">) → GitHub Secrets (</w:t>
+        <w:t xml:space="preserve">) → GitHub</w:t>
+      </w:r>
+      <w:r>
+        <w:t xml:space="preserve"> </w:t>
+      </w:r>
+      <w:r>
+        <w:t xml:space="preserve">Secrets (</w:t>
       </w:r>
       <w:r>
         <w:rPr>
@@ -1273,7 +1017,7 @@
         <w:t xml:space="preserve"> </w:t>
       </w:r>
       <w:r>
-        <w:t xml:space="preserve">🎙️ "Esta es la parte central del proyecto: el</w:t>
+        <w:t xml:space="preserve">🎙️ "Esta es la parte central: el</w:t>
       </w:r>
       <w:r>
         <w:t xml:space="preserve"> </w:t>
@@ -1286,13 +1030,96 @@
         <w:t xml:space="preserve">pipeline de CI/CD</w:t>
       </w:r>
       <w:r>
-        <w:t xml:space="preserve">. Está en GitHub Actions, en el</w:t>
-      </w:r>
-      <w:r>
-        <w:t xml:space="preserve"> </w:t>
-      </w:r>
-      <w:r>
-        <w:t xml:space="preserve">archivo</w:t>
+        <w:t xml:space="preserve"> </w:t>
+      </w:r>
+      <w:r>
+        <w:t xml:space="preserve">en GitHub Actions, que corre en cada</w:t>
+      </w:r>
+      <w:r>
+        <w:t xml:space="preserve"> </w:t>
+      </w:r>
+      <w:r>
+        <w:rPr>
+          <w:b/>
+          <w:bCs/>
+        </w:rPr>
+        <w:t xml:space="preserve">push a main</w:t>
+      </w:r>
+      <w:r>
+        <w:t xml:space="preserve">. El flujo es</w:t>
+      </w:r>
+      <w:r>
+        <w:t xml:space="preserve"> </w:t>
+      </w:r>
+      <w:r>
+        <w:rPr>
+          <w:b/>
+          <w:bCs/>
+        </w:rPr>
+        <w:t xml:space="preserve">build → push → deploy</w:t>
+      </w:r>
+      <w:r>
+        <w:t xml:space="preserve">: construye las imágenes de frontend y</w:t>
+      </w:r>
+      <w:r>
+        <w:t xml:space="preserve"> </w:t>
+      </w:r>
+      <w:r>
+        <w:t xml:space="preserve">backend, las</w:t>
+      </w:r>
+      <w:r>
+        <w:t xml:space="preserve"> </w:t>
+      </w:r>
+      <w:r>
+        <w:rPr>
+          <w:b/>
+          <w:bCs/>
+        </w:rPr>
+        <w:t xml:space="preserve">sube a ECR</w:t>
+      </w:r>
+      <w:r>
+        <w:t xml:space="preserve"> </w:t>
+      </w:r>
+      <w:r>
+        <w:t xml:space="preserve">con el hash del commit,</w:t>
+      </w:r>
+      <w:r>
+        <w:t xml:space="preserve"> </w:t>
+      </w:r>
+      <w:r>
+        <w:rPr>
+          <w:b/>
+          <w:bCs/>
+        </w:rPr>
+        <w:t xml:space="preserve">renderiza la task definition</w:t>
+      </w:r>
+      <w:r>
+        <w:t xml:space="preserve"> </w:t>
+      </w:r>
+      <w:r>
+        <w:t xml:space="preserve">con la imagen</w:t>
+      </w:r>
+      <w:r>
+        <w:t xml:space="preserve"> </w:t>
+      </w:r>
+      <w:r>
+        <w:t xml:space="preserve">nueva y hace</w:t>
+      </w:r>
+      <w:r>
+        <w:t xml:space="preserve"> </w:t>
+      </w:r>
+      <w:r>
+        <w:rPr>
+          <w:b/>
+          <w:bCs/>
+        </w:rPr>
+        <w:t xml:space="preserve">deploy en ECS</w:t>
+      </w:r>
+      <w:r>
+        <w:t xml:space="preserve"> </w:t>
+      </w:r>
+      <w:r>
+        <w:t xml:space="preserve">esperando estabilidad con</w:t>
       </w:r>
       <w:r>
         <w:t xml:space="preserve"> </w:t>
@@ -1301,240 +1128,51 @@
         <w:rPr>
           <w:rStyle w:val="VerbatimChar"/>
         </w:rPr>
-        <w:t xml:space="preserve">deploy-ecs.yml</w:t>
-      </w:r>
-      <w:r>
-        <w:t xml:space="preserve">, y se ejecuta automáticamente</w:t>
-      </w:r>
-      <w:r>
-        <w:t xml:space="preserve"> </w:t>
-      </w:r>
-      <w:r>
-        <w:rPr>
-          <w:b/>
-          <w:bCs/>
-        </w:rPr>
-        <w:t xml:space="preserve">cada vez que hacemos push a la rama main</w:t>
-      </w:r>
-      <w:r>
-        <w:t xml:space="preserve">.</w:t>
-      </w:r>
-      <w:r>
-        <w:t xml:space="preserve"> </w:t>
-      </w:r>
-      <w:r>
-        <w:t xml:space="preserve">El flujo es</w:t>
-      </w:r>
-      <w:r>
-        <w:t xml:space="preserve"> </w:t>
-      </w:r>
-      <w:r>
-        <w:rPr>
-          <w:b/>
-          <w:bCs/>
-        </w:rPr>
-        <w:t xml:space="preserve">build → push → deploy</w:t>
-      </w:r>
-      <w:r>
-        <w:t xml:space="preserve">: primero hace el</w:t>
-      </w:r>
-      <w:r>
-        <w:t xml:space="preserve"> </w:t>
-      </w:r>
-      <w:r>
-        <w:rPr>
-          <w:b/>
-          <w:bCs/>
-        </w:rPr>
-        <w:t xml:space="preserve">build</w:t>
-      </w:r>
-      <w:r>
-        <w:t xml:space="preserve"> </w:t>
-      </w:r>
-      <w:r>
-        <w:t xml:space="preserve">de las imágenes de frontend y</w:t>
-      </w:r>
-      <w:r>
-        <w:t xml:space="preserve"> </w:t>
-      </w:r>
-      <w:r>
-        <w:t xml:space="preserve">backend; luego las</w:t>
-      </w:r>
-      <w:r>
-        <w:t xml:space="preserve"> </w:t>
-      </w:r>
-      <w:r>
-        <w:rPr>
-          <w:b/>
-          <w:bCs/>
-        </w:rPr>
-        <w:t xml:space="preserve">sube a ECR</w:t>
-      </w:r>
-      <w:r>
-        <w:t xml:space="preserve"> </w:t>
-      </w:r>
-      <w:r>
-        <w:t xml:space="preserve">etiquetadas con el hash del commit, para tener trazabilidad;</w:t>
-      </w:r>
-      <w:r>
-        <w:t xml:space="preserve"> </w:t>
-      </w:r>
-      <w:r>
-        <w:t xml:space="preserve">después</w:t>
-      </w:r>
-      <w:r>
-        <w:t xml:space="preserve"> </w:t>
-      </w:r>
-      <w:r>
-        <w:rPr>
-          <w:b/>
-          <w:bCs/>
-        </w:rPr>
-        <w:t xml:space="preserve">renderiza la task definition</w:t>
-      </w:r>
-      <w:r>
-        <w:t xml:space="preserve"> </w:t>
-      </w:r>
-      <w:r>
-        <w:t xml:space="preserve">con la imagen nueva; y finalmente hace el</w:t>
-      </w:r>
-      <w:r>
-        <w:t xml:space="preserve"> </w:t>
-      </w:r>
-      <w:r>
-        <w:rPr>
-          <w:b/>
-          <w:bCs/>
-        </w:rPr>
-        <w:t xml:space="preserve">deploy en</w:t>
-      </w:r>
-      <w:r>
-        <w:rPr>
-          <w:b/>
-          <w:bCs/>
-        </w:rPr>
-        <w:t xml:space="preserve"> </w:t>
-      </w:r>
-      <w:r>
-        <w:rPr>
-          <w:b/>
-          <w:bCs/>
-        </w:rPr>
-        <w:t xml:space="preserve">ECS</w:t>
-      </w:r>
-      <w:r>
-        <w:t xml:space="preserve">, esperando a que el servicio quede estable con</w:t>
-      </w:r>
-      <w:r>
-        <w:t xml:space="preserve"> </w:t>
-      </w:r>
-      <w:r>
-        <w:rPr>
-          <w:rStyle w:val="VerbatimChar"/>
-        </w:rPr>
         <w:t xml:space="preserve">wait-for-service-stability</w:t>
       </w:r>
       <w:r>
-        <w:t xml:space="preserve">. Eso significa</w:t>
-      </w:r>
-      <w:r>
-        <w:t xml:space="preserve"> </w:t>
-      </w:r>
-      <w:r>
-        <w:t xml:space="preserve">que el pipeline</w:t>
-      </w:r>
-      <w:r>
-        <w:t xml:space="preserve"> </w:t>
-      </w:r>
-      <w:r>
-        <w:rPr>
-          <w:b/>
-          <w:bCs/>
-        </w:rPr>
-        <w:t xml:space="preserve">no se da por exitoso hasta que ECS confirma</w:t>
-      </w:r>
-      <w:r>
-        <w:t xml:space="preserve"> </w:t>
-      </w:r>
-      <w:r>
-        <w:t xml:space="preserve">que las tareas nuevas están sanas.</w:t>
-      </w:r>
-      <w:r>
-        <w:t xml:space="preserve"> </w:t>
-      </w:r>
-      <w:r>
-        <w:t xml:space="preserve">Las credenciales de AWS las guardamos como</w:t>
-      </w:r>
-      <w:r>
-        <w:t xml:space="preserve"> </w:t>
-      </w:r>
-      <w:r>
-        <w:rPr>
-          <w:b/>
-          <w:bCs/>
-        </w:rPr>
-        <w:t xml:space="preserve">secrets del repositorio</w:t>
-      </w:r>
-      <w:r>
-        <w:t xml:space="preserve"> </w:t>
-      </w:r>
-      <w:r>
-        <w:t xml:space="preserve">en GitHub, nunca en el</w:t>
-      </w:r>
-      <w:r>
-        <w:t xml:space="preserve"> </w:t>
-      </w:r>
-      <w:r>
-        <w:t xml:space="preserve">código. Aquí vemos una ejecución completa</w:t>
-      </w:r>
-      <w:r>
-        <w:t xml:space="preserve"> </w:t>
-      </w:r>
-      <w:r>
-        <w:rPr>
-          <w:b/>
-          <w:bCs/>
-        </w:rPr>
-        <w:t xml:space="preserve">en verde</w:t>
-      </w:r>
-      <w:r>
-        <w:t xml:space="preserve">: build, push y deploy de los dos servicios,</w:t>
-      </w:r>
-      <w:r>
-        <w:t xml:space="preserve"> </w:t>
-      </w:r>
-      <w:r>
-        <w:t xml:space="preserve">todo automático tras un commit."</w:t>
-      </w:r>
-    </w:p>
-    <w:p>
-      <w:pPr>
-        <w:pStyle w:val="BodyText"/>
-      </w:pPr>
-      <w:r>
-        <w:t xml:space="preserve">🎙️</w:t>
-      </w:r>
-      <w:r>
-        <w:t xml:space="preserve"> </w:t>
-      </w:r>
-      <w:r>
-        <w:rPr>
-          <w:i/>
-          <w:iCs/>
-        </w:rPr>
-        <w:t xml:space="preserve">(Opcional, si pueden hacer demo):</w:t>
-      </w:r>
-      <w:r>
-        <w:t xml:space="preserve"> </w:t>
-      </w:r>
-      <w:r>
-        <w:t xml:space="preserve">"Si hago un cambio y un commit, el pipeline arranca solo y</w:t>
-      </w:r>
-      <w:r>
-        <w:t xml:space="preserve"> </w:t>
-      </w:r>
-      <w:r>
-        <w:t xml:space="preserve">en unos 10–15 minutos la nueva versión queda desplegada en el clúster, sin tocar nada a mano."</w:t>
+        <w:t xml:space="preserve"> </w:t>
+      </w:r>
+      <w:r>
+        <w:t xml:space="preserve">— o sea, no</w:t>
+      </w:r>
+      <w:r>
+        <w:t xml:space="preserve"> </w:t>
+      </w:r>
+      <w:r>
+        <w:t xml:space="preserve">se da por exitoso hasta que las tareas nuevas están sanas. Las credenciales de AWS van como</w:t>
+      </w:r>
+      <w:r>
+        <w:t xml:space="preserve"> </w:t>
+      </w:r>
+      <w:r>
+        <w:rPr>
+          <w:b/>
+          <w:bCs/>
+        </w:rPr>
+        <w:t xml:space="preserve">secrets de GitHub</w:t>
+      </w:r>
+      <w:r>
+        <w:t xml:space="preserve">, nunca en el código. Aquí vemos una</w:t>
+      </w:r>
+      <w:r>
+        <w:t xml:space="preserve"> </w:t>
+      </w:r>
+      <w:r>
+        <w:rPr>
+          <w:b/>
+          <w:bCs/>
+        </w:rPr>
+        <w:t xml:space="preserve">ejecución completa en verde</w:t>
+      </w:r>
+      <w:r>
+        <w:t xml:space="preserve">: build,</w:t>
+      </w:r>
+      <w:r>
+        <w:t xml:space="preserve"> </w:t>
+      </w:r>
+      <w:r>
+        <w:t xml:space="preserve">push y deploy de los dos servicios, todo automático tras un commit."</w:t>
       </w:r>
     </w:p>
     <w:p>
@@ -1545,13 +1183,13 @@
       </w:r>
     </w:p>
     <w:bookmarkEnd w:id="14"/>
-    <w:bookmarkStart w:id="15" w:name="segmento-6--autoscaling--1-min"/>
+    <w:bookmarkStart w:id="15" w:name="segmento-6--autoscaling--40-s"/>
     <w:p>
       <w:pPr>
         <w:pStyle w:val="Heading3"/>
       </w:pPr>
       <w:r>
-        <w:t xml:space="preserve">Segmento 6 — Autoscaling · ~1 min</w:t>
+        <w:t xml:space="preserve">Segmento 6 — Autoscaling · ~40 s</w:t>
       </w:r>
     </w:p>
     <w:p>
@@ -1559,7 +1197,7 @@
         <w:pStyle w:val="FirstParagraph"/>
       </w:pPr>
       <w:r>
-        <w:t xml:space="preserve">🖥️ Política de autoscaling (</w:t>
+        <w:t xml:space="preserve">🖥️ Política de escalado (</w:t>
       </w:r>
       <w:r>
         <w:rPr>
@@ -1568,13 +1206,7 @@
         <w:t xml:space="preserve">ie3-autoscaling.png</w:t>
       </w:r>
       <w:r>
-        <w:t xml:space="preserve">) → métrica de CPU en CloudWatch</w:t>
-      </w:r>
-      <w:r>
-        <w:t xml:space="preserve"> </w:t>
-      </w:r>
-      <w:r>
-        <w:t xml:space="preserve">(</w:t>
+        <w:t xml:space="preserve">) → CPU en CloudWatch (</w:t>
       </w:r>
       <w:r>
         <w:rPr>
@@ -1589,20 +1221,7 @@
         <w:t xml:space="preserve"> </w:t>
       </w:r>
       <w:r>
-        <w:t xml:space="preserve">🎙️ "Para que la aplicación</w:t>
-      </w:r>
-      <w:r>
-        <w:t xml:space="preserve"> </w:t>
-      </w:r>
-      <w:r>
-        <w:rPr>
-          <w:b/>
-          <w:bCs/>
-        </w:rPr>
-        <w:t xml:space="preserve">escale sola</w:t>
-      </w:r>
-      <w:r>
-        <w:t xml:space="preserve">, configuramos</w:t>
+        <w:t xml:space="preserve">🎙️ "Para que escale solo, configuramos</w:t>
       </w:r>
       <w:r>
         <w:t xml:space="preserve"> </w:t>
@@ -1618,13 +1237,7 @@
         <w:t xml:space="preserve"> </w:t>
       </w:r>
       <w:r>
-        <w:t xml:space="preserve">con una</w:t>
-      </w:r>
-      <w:r>
-        <w:t xml:space="preserve"> </w:t>
-      </w:r>
-      <w:r>
-        <w:t xml:space="preserve">política de</w:t>
+        <w:t xml:space="preserve">con</w:t>
       </w:r>
       <w:r>
         <w:t xml:space="preserve"> </w:t>
@@ -1653,7 +1266,7 @@
         <w:t xml:space="preserve">CPU</w:t>
       </w:r>
       <w:r>
-        <w:t xml:space="preserve">, con objetivo del</w:t>
+        <w:t xml:space="preserve">, objetivo</w:t>
       </w:r>
       <w:r>
         <w:t xml:space="preserve"> </w:t>
@@ -1666,73 +1279,13 @@
         <w:t xml:space="preserve">50%</w:t>
       </w:r>
       <w:r>
-        <w:t xml:space="preserve">. Esto quiere decir que si</w:t>
-      </w:r>
-      <w:r>
-        <w:t xml:space="preserve"> </w:t>
-      </w:r>
-      <w:r>
-        <w:t xml:space="preserve">la CPU promedio del servicio pasa de 50%, ECS</w:t>
-      </w:r>
-      <w:r>
-        <w:t xml:space="preserve"> </w:t>
-      </w:r>
-      <w:r>
-        <w:rPr>
-          <w:b/>
-          <w:bCs/>
-        </w:rPr>
-        <w:t xml:space="preserve">agrega tareas</w:t>
-      </w:r>
-      <w:r>
-        <w:t xml:space="preserve"> </w:t>
-      </w:r>
-      <w:r>
-        <w:t xml:space="preserve">automáticamente, hasta un máximo de</w:t>
-      </w:r>
-      <w:r>
-        <w:t xml:space="preserve"> </w:t>
-      </w:r>
-      <w:r>
-        <w:t xml:space="preserve">4; y cuando baja la carga, las</w:t>
-      </w:r>
-      <w:r>
-        <w:t xml:space="preserve"> </w:t>
-      </w:r>
-      <w:r>
-        <w:rPr>
-          <w:b/>
-          <w:bCs/>
-        </w:rPr>
-        <w:t xml:space="preserve">quita</w:t>
-      </w:r>
-      <w:r>
-        <w:t xml:space="preserve">, hasta un mínimo de 2. Elegimos 50% para dejar margen y</w:t>
-      </w:r>
-      <w:r>
-        <w:t xml:space="preserve"> </w:t>
-      </w:r>
-      <w:r>
-        <w:t xml:space="preserve">absorber picos antes de saturar. En CloudWatch vemos la métrica de CPU que dispara este</w:t>
-      </w:r>
-      <w:r>
-        <w:t xml:space="preserve"> </w:t>
-      </w:r>
-      <w:r>
-        <w:t xml:space="preserve">comportamiento, y en la consola quedan registradas las</w:t>
-      </w:r>
-      <w:r>
-        <w:t xml:space="preserve"> </w:t>
-      </w:r>
-      <w:r>
-        <w:rPr>
-          <w:b/>
-          <w:bCs/>
-        </w:rPr>
-        <w:t xml:space="preserve">actividades de escalado</w:t>
-      </w:r>
-      <w:r>
-        <w:t xml:space="preserve">."</w:t>
+        <w:t xml:space="preserve">: si la CPU sube de 50%, ECS agrega tareas hasta 4; cuando baja, las quita</w:t>
+      </w:r>
+      <w:r>
+        <w:t xml:space="preserve"> </w:t>
+      </w:r>
+      <w:r>
+        <w:t xml:space="preserve">hasta 2. En CloudWatch se ve la métrica de CPU y en la consola las actividades de escalado."</w:t>
       </w:r>
     </w:p>
     <w:p>
@@ -1743,13 +1296,13 @@
       </w:r>
     </w:p>
     <w:bookmarkEnd w:id="15"/>
-    <w:bookmarkStart w:id="16" w:name="X8e7033ffb02c847820a671e35850e7635692066"/>
+    <w:bookmarkStart w:id="16" w:name="X3c8be117615af293a4fb957a8c8713e6ac402b2"/>
     <w:p>
       <w:pPr>
         <w:pStyle w:val="Heading3"/>
       </w:pPr>
       <w:r>
-        <w:t xml:space="preserve">Segmento 7 — Logs y validación funcional · ~1 min 15 s</w:t>
+        <w:t xml:space="preserve">Segmento 7 — Logs y validación funcional · ~45 s</w:t>
       </w:r>
     </w:p>
     <w:p>
@@ -1766,7 +1319,7 @@
         <w:t xml:space="preserve">ie6-cloudwatch-logs.png</w:t>
       </w:r>
       <w:r>
-        <w:t xml:space="preserve">) → app funcionando (</w:t>
+        <w:t xml:space="preserve">) → app (</w:t>
       </w:r>
       <w:r>
         <w:rPr>
@@ -1775,28 +1328,13 @@
         <w:t xml:space="preserve">ie2-app-navegador.png</w:t>
       </w:r>
       <w:r>
-        <w:t xml:space="preserve">) →</w:t>
-      </w:r>
-      <w:r>
-        <w:t xml:space="preserve"> </w:t>
-      </w:r>
-      <w:r>
-        <w:t xml:space="preserve">eventos del servicio (</w:t>
-      </w:r>
-      <w:r>
-        <w:rPr>
-          <w:rStyle w:val="VerbatimChar"/>
-        </w:rPr>
-        <w:t xml:space="preserve">ie7-eventos-steady.png</w:t>
-      </w:r>
-      <w:r>
         <w:t xml:space="preserve">).</w:t>
       </w:r>
       <w:r>
         <w:t xml:space="preserve"> </w:t>
       </w:r>
       <w:r>
-        <w:t xml:space="preserve">🎙️ "Para observabilidad, los tres contenedores envían sus</w:t>
+        <w:t xml:space="preserve">🎙️ "Los tres contenedores envían</w:t>
       </w:r>
       <w:r>
         <w:t xml:space="preserve"> </w:t>
@@ -1809,85 +1347,41 @@
         <w:t xml:space="preserve">logs a CloudWatch</w:t>
       </w:r>
       <w:r>
-        <w:t xml:space="preserve">. Aquí vemos los</w:t>
-      </w:r>
-      <w:r>
-        <w:t xml:space="preserve"> </w:t>
-      </w:r>
-      <w:r>
-        <w:t xml:space="preserve">logs del backend: inicializa el pool de conexiones a MySQL y queda escuchando en el puerto 3001,</w:t>
-      </w:r>
-      <w:r>
-        <w:t xml:space="preserve"> </w:t>
-      </w:r>
-      <w:r>
-        <w:t xml:space="preserve">lo que confirma que se conectó bien a la base de datos. Y la prueba final es la app misma: al abrir</w:t>
-      </w:r>
-      <w:r>
-        <w:t xml:space="preserve"> </w:t>
-      </w:r>
-      <w:r>
-        <w:t xml:space="preserve">la URL del ALB, el frontend carga, y al pedir los productos, el frontend llama al backend, el</w:t>
-      </w:r>
-      <w:r>
-        <w:t xml:space="preserve"> </w:t>
-      </w:r>
-      <w:r>
-        <w:t xml:space="preserve">backend consulta MySQL y devuelve los datos. Toda la cadena</w:t>
-      </w:r>
-      <w:r>
-        <w:t xml:space="preserve"> </w:t>
-      </w:r>
-      <w:r>
-        <w:rPr>
-          <w:b/>
-          <w:bCs/>
-        </w:rPr>
-        <w:t xml:space="preserve">Front → Back → Base de datos</w:t>
-      </w:r>
-      <w:r>
-        <w:t xml:space="preserve"> </w:t>
-      </w:r>
-      <w:r>
-        <w:t xml:space="preserve">funciona. En los eventos del servicio se ve cómo los despliegues alcanzan el</w:t>
-      </w:r>
-      <w:r>
-        <w:t xml:space="preserve"> </w:t>
-      </w:r>
-      <w:r>
-        <w:rPr>
-          <w:i/>
-          <w:iCs/>
-        </w:rPr>
-        <w:t xml:space="preserve">steady state</w:t>
-      </w:r>
-      <w:r>
-        <w:t xml:space="preserve"> </w:t>
-      </w:r>
-      <w:r>
-        <w:t xml:space="preserve">y se</w:t>
-      </w:r>
-      <w:r>
-        <w:t xml:space="preserve"> </w:t>
-      </w:r>
-      <w:r>
-        <w:t xml:space="preserve">registran los destinos en el balanceador. Si una tarea se cae, ECS</w:t>
-      </w:r>
-      <w:r>
-        <w:t xml:space="preserve"> </w:t>
-      </w:r>
-      <w:r>
-        <w:rPr>
-          <w:b/>
-          <w:bCs/>
-        </w:rPr>
-        <w:t xml:space="preserve">levanta otra automáticamente</w:t>
-      </w:r>
-      <w:r>
-        <w:t xml:space="preserve"> </w:t>
-      </w:r>
-      <w:r>
-        <w:t xml:space="preserve">para mantener la disponibilidad."</w:t>
+        <w:t xml:space="preserve">; aquí el backend inicializa el pool de</w:t>
+      </w:r>
+      <w:r>
+        <w:t xml:space="preserve"> </w:t>
+      </w:r>
+      <w:r>
+        <w:t xml:space="preserve">MySQL y escucha en el 3001, lo que confirma la conexión. Y la prueba final es la app: al abrir la</w:t>
+      </w:r>
+      <w:r>
+        <w:t xml:space="preserve"> </w:t>
+      </w:r>
+      <w:r>
+        <w:t xml:space="preserve">URL del ALB, el frontend carga, pide los productos, el backend consulta MySQL y los devuelve. Toda</w:t>
+      </w:r>
+      <w:r>
+        <w:t xml:space="preserve"> </w:t>
+      </w:r>
+      <w:r>
+        <w:t xml:space="preserve">la cadena</w:t>
+      </w:r>
+      <w:r>
+        <w:t xml:space="preserve"> </w:t>
+      </w:r>
+      <w:r>
+        <w:rPr>
+          <w:b/>
+          <w:bCs/>
+        </w:rPr>
+        <w:t xml:space="preserve">front → back → base de datos</w:t>
+      </w:r>
+      <w:r>
+        <w:t xml:space="preserve"> </w:t>
+      </w:r>
+      <w:r>
+        <w:t xml:space="preserve">funciona, y si una tarea se cae, ECS levanta otra sola."</w:t>
       </w:r>
     </w:p>
     <w:p>
@@ -1898,13 +1392,13 @@
       </w:r>
     </w:p>
     <w:bookmarkEnd w:id="16"/>
-    <w:bookmarkStart w:id="17" w:name="X7490ea84c64c7a253aaf93a4591cbbd9aab2404"/>
+    <w:bookmarkStart w:id="17" w:name="segmento-8--problemas-y-soluciones--40-s"/>
     <w:p>
       <w:pPr>
         <w:pStyle w:val="Heading3"/>
       </w:pPr>
       <w:r>
-        <w:t xml:space="preserve">Segmento 8 — Problemas que enfrentamos y cómo los resolvimos · ~1 min 15 s</w:t>
+        <w:t xml:space="preserve">Segmento 8 — Problemas y soluciones · ~40 s</w:t>
       </w:r>
     </w:p>
     <w:p>
@@ -1912,13 +1406,205 @@
         <w:pStyle w:val="FirstParagraph"/>
       </w:pPr>
       <w:r>
-        <w:t xml:space="preserve">🖥️ Diapositiva de bullets (o la tabla §10 del informe).</w:t>
-      </w:r>
-      <w:r>
-        <w:t xml:space="preserve"> </w:t>
-      </w:r>
-      <w:r>
-        <w:t xml:space="preserve">🎙️ "Durante la implementación tuvimos varios problemas reales y aprendimos de ellos:</w:t>
+        <w:t xml:space="preserve">🖥️ Diapositiva de bullets (o tabla §10 del informe).</w:t>
+      </w:r>
+      <w:r>
+        <w:t xml:space="preserve"> </w:t>
+      </w:r>
+      <w:r>
+        <w:t xml:space="preserve">🎙️ "Tuvimos problemas reales: el lab no permite descubrimiento de servicios, así que usamos</w:t>
+      </w:r>
+      <w:r>
+        <w:t xml:space="preserve"> </w:t>
+      </w:r>
+      <w:r>
+        <w:t xml:space="preserve">balanceadores; no podíamos crear roles IAM, por eso Fargate con</w:t>
+      </w:r>
+      <w:r>
+        <w:t xml:space="preserve"> </w:t>
+      </w:r>
+      <w:r>
+        <w:rPr>
+          <w:rStyle w:val="VerbatimChar"/>
+        </w:rPr>
+        <w:t xml:space="preserve">LabRole</w:t>
+      </w:r>
+      <w:r>
+        <w:t xml:space="preserve">; y el pipeline falló una</w:t>
+      </w:r>
+      <w:r>
+        <w:t xml:space="preserve"> </w:t>
+      </w:r>
+      <w:r>
+        <w:t xml:space="preserve">vez por no tener cargados los secrets, y otra por un</w:t>
+      </w:r>
+      <w:r>
+        <w:t xml:space="preserve"> </w:t>
+      </w:r>
+      <w:r>
+        <w:rPr>
+          <w:b/>
+          <w:bCs/>
+        </w:rPr>
+        <w:t xml:space="preserve">rollback automático del circuit breaker</w:t>
+      </w:r>
+      <w:r>
+        <w:t xml:space="preserve"> </w:t>
+      </w:r>
+      <w:r>
+        <w:t xml:space="preserve">de</w:t>
+      </w:r>
+      <w:r>
+        <w:t xml:space="preserve"> </w:t>
+      </w:r>
+      <w:r>
+        <w:t xml:space="preserve">ECS cuando las tareas no estabilizaron. Todo lo diagnosticamos</w:t>
+      </w:r>
+      <w:r>
+        <w:t xml:space="preserve"> </w:t>
+      </w:r>
+      <w:r>
+        <w:rPr>
+          <w:b/>
+          <w:bCs/>
+        </w:rPr>
+        <w:t xml:space="preserve">leyendo los logs</w:t>
+      </w:r>
+      <w:r>
+        <w:t xml:space="preserve">."</w:t>
+      </w:r>
+    </w:p>
+    <w:p>
+      <w:r>
+        <w:pict>
+          <v:rect style="width:0;height:1.5pt" o:hralign="center" o:hrstd="t" o:hr="t"/>
+        </w:pict>
+      </w:r>
+    </w:p>
+    <w:bookmarkEnd w:id="17"/>
+    <w:bookmarkStart w:id="18" w:name="segmento-9--conclusión--25-s"/>
+    <w:p>
+      <w:pPr>
+        <w:pStyle w:val="Heading3"/>
+      </w:pPr>
+      <w:r>
+        <w:t xml:space="preserve">Segmento 9 — Conclusión · ~25 s</w:t>
+      </w:r>
+    </w:p>
+    <w:p>
+      <w:pPr>
+        <w:pStyle w:val="FirstParagraph"/>
+      </w:pPr>
+      <w:r>
+        <w:t xml:space="preserve">🖥️ Diapositiva de cierre / diagrama de arquitectura.</w:t>
+      </w:r>
+      <w:r>
+        <w:t xml:space="preserve"> </w:t>
+      </w:r>
+      <w:r>
+        <w:t xml:space="preserve">🎙️ "En resumen, la app quedó</w:t>
+      </w:r>
+      <w:r>
+        <w:t xml:space="preserve"> </w:t>
+      </w:r>
+      <w:r>
+        <w:rPr>
+          <w:b/>
+          <w:bCs/>
+        </w:rPr>
+        <w:t xml:space="preserve">orquestada, escalable, tolerante a fallos y con despliegue</w:t>
+      </w:r>
+      <w:r>
+        <w:rPr>
+          <w:b/>
+          <w:bCs/>
+        </w:rPr>
+        <w:t xml:space="preserve"> </w:t>
+      </w:r>
+      <w:r>
+        <w:rPr>
+          <w:b/>
+          <w:bCs/>
+        </w:rPr>
+        <w:t xml:space="preserve">automático</w:t>
+      </w:r>
+      <w:r>
+        <w:t xml:space="preserve">. Para producción real separaríamos los roles IAM, usaríamos</w:t>
+      </w:r>
+      <w:r>
+        <w:t xml:space="preserve"> </w:t>
+      </w:r>
+      <w:r>
+        <w:rPr>
+          <w:b/>
+          <w:bCs/>
+        </w:rPr>
+        <w:t xml:space="preserve">Amazon RDS</w:t>
+      </w:r>
+      <w:r>
+        <w:t xml:space="preserve">,</w:t>
+      </w:r>
+      <w:r>
+        <w:t xml:space="preserve"> </w:t>
+      </w:r>
+      <w:r>
+        <w:rPr>
+          <w:b/>
+          <w:bCs/>
+        </w:rPr>
+        <w:t xml:space="preserve">HTTPS</w:t>
+      </w:r>
+      <w:r>
+        <w:t xml:space="preserve"> </w:t>
+      </w:r>
+      <w:r>
+        <w:t xml:space="preserve">y</w:t>
+      </w:r>
+      <w:r>
+        <w:t xml:space="preserve"> </w:t>
+      </w:r>
+      <w:r>
+        <w:rPr>
+          <w:b/>
+          <w:bCs/>
+        </w:rPr>
+        <w:t xml:space="preserve">OIDC</w:t>
+      </w:r>
+      <w:r>
+        <w:t xml:space="preserve"> </w:t>
+      </w:r>
+      <w:r>
+        <w:t xml:space="preserve">entre GitHub y AWS. ¡Gracias!"</w:t>
+      </w:r>
+    </w:p>
+    <w:p>
+      <w:r>
+        <w:pict>
+          <v:rect style="width:0;height:1.5pt" o:hralign="center" o:hrstd="t" o:hr="t"/>
+        </w:pict>
+      </w:r>
+    </w:p>
+    <w:p>
+      <w:pPr>
+        <w:pStyle w:val="FirstParagraph"/>
+      </w:pPr>
+      <w:r>
+        <w:rPr>
+          <w:b/>
+          <w:bCs/>
+        </w:rPr>
+        <w:t xml:space="preserve">Duración total estimada: ~7 minutos.</w:t>
+      </w:r>
+    </w:p>
+    <w:bookmarkEnd w:id="18"/>
+    <w:bookmarkEnd w:id="19"/>
+    <w:bookmarkStart w:id="20" w:name="checklist-antes-de-grabar"/>
+    <w:p>
+      <w:pPr>
+        <w:pStyle w:val="Heading2"/>
+      </w:pPr>
+      <w:r>
+        <w:t xml:space="preserve">Checklist antes de grabar</w:t>
       </w:r>
     </w:p>
     <w:p>
@@ -1930,317 +1616,16 @@
         </w:numPr>
       </w:pPr>
       <w:r>
-        <w:t xml:space="preserve">El laboratorio</w:t>
-      </w:r>
-      <w:r>
-        <w:t xml:space="preserve"> </w:t>
-      </w:r>
-      <w:r>
-        <w:rPr>
-          <w:b/>
-          <w:bCs/>
-        </w:rPr>
-        <w:t xml:space="preserve">no permite descubrimiento de servicios</w:t>
-      </w:r>
-      <w:r>
-        <w:t xml:space="preserve">, así que rediseñamos la comunicación</w:t>
-      </w:r>
-      <w:r>
-        <w:t xml:space="preserve"> </w:t>
-      </w:r>
-      <w:r>
-        <w:t xml:space="preserve">con balanceadores: ALB para front-back y NLB para la base de datos.</w:t>
-      </w:r>
-    </w:p>
-    <w:p>
-      <w:pPr>
-        <w:pStyle w:val="Compact"/>
-        <w:numPr>
-          <w:ilvl w:val="0"/>
-          <w:numId w:val="1001"/>
-        </w:numPr>
-      </w:pPr>
-      <w:r>
-        <w:t xml:space="preserve">No podíamos crear roles de IAM, por eso usamos Fargate con el rol</w:t>
-      </w:r>
-      <w:r>
-        <w:t xml:space="preserve"> </w:t>
+        <w:t xml:space="preserve">Capturas abiertas y en orden (</w:t>
       </w:r>
       <w:r>
         <w:rPr>
           <w:rStyle w:val="VerbatimChar"/>
         </w:rPr>
-        <w:t xml:space="preserve">LabRole</w:t>
-      </w:r>
-      <w:r>
-        <w:t xml:space="preserve">.</w:t>
-      </w:r>
-    </w:p>
-    <w:p>
-      <w:pPr>
-        <w:pStyle w:val="Compact"/>
-        <w:numPr>
-          <w:ilvl w:val="0"/>
-          <w:numId w:val="1001"/>
-        </w:numPr>
-      </w:pPr>
-      <w:r>
-        <w:t xml:space="preserve">En el pipeline, una primera ejecución</w:t>
-      </w:r>
-      <w:r>
-        <w:t xml:space="preserve"> </w:t>
-      </w:r>
-      <w:r>
-        <w:rPr>
-          <w:b/>
-          <w:bCs/>
-        </w:rPr>
-        <w:t xml:space="preserve">falló porque todavía no habíamos cargado los secrets</w:t>
-      </w:r>
-      <w:r>
-        <w:t xml:space="preserve"> </w:t>
-      </w:r>
-      <w:r>
-        <w:t xml:space="preserve">de</w:t>
-      </w:r>
-      <w:r>
-        <w:t xml:space="preserve"> </w:t>
-      </w:r>
-      <w:r>
-        <w:t xml:space="preserve">AWS; el log decía</w:t>
-      </w:r>
-      <w:r>
-        <w:t xml:space="preserve"> </w:t>
-      </w:r>
-      <w:r>
-        <w:rPr>
-          <w:i/>
-          <w:iCs/>
-        </w:rPr>
-        <w:t xml:space="preserve">'Could not load credentials'</w:t>
-      </w:r>
-      <w:r>
-        <w:t xml:space="preserve">. Lo solucionamos cargándolos.</w:t>
-      </w:r>
-    </w:p>
-    <w:p>
-      <w:pPr>
-        <w:pStyle w:val="Compact"/>
-        <w:numPr>
-          <w:ilvl w:val="0"/>
-          <w:numId w:val="1001"/>
-        </w:numPr>
-      </w:pPr>
-      <w:r>
-        <w:t xml:space="preserve">Otra ejecución hizo</w:t>
-      </w:r>
-      <w:r>
-        <w:t xml:space="preserve"> </w:t>
-      </w:r>
-      <w:r>
-        <w:rPr>
-          <w:b/>
-          <w:bCs/>
-        </w:rPr>
-        <w:t xml:space="preserve">rollback automático por el circuit breaker</w:t>
-      </w:r>
-      <w:r>
-        <w:t xml:space="preserve"> </w:t>
-      </w:r>
-      <w:r>
-        <w:t xml:space="preserve">de ECS cuando las tareas</w:t>
-      </w:r>
-      <w:r>
-        <w:t xml:space="preserve"> </w:t>
-      </w:r>
-      <w:r>
-        <w:t xml:space="preserve">nuevas no estabilizaron; al relanzar, quedó estable.</w:t>
-      </w:r>
-    </w:p>
-    <w:p>
-      <w:pPr>
-        <w:pStyle w:val="Compact"/>
-        <w:numPr>
-          <w:ilvl w:val="0"/>
-          <w:numId w:val="1001"/>
-        </w:numPr>
-      </w:pPr>
-      <w:r>
-        <w:t xml:space="preserve">Y como el laboratorio se reinicia, las</w:t>
-      </w:r>
-      <w:r>
-        <w:t xml:space="preserve"> </w:t>
-      </w:r>
-      <w:r>
-        <w:rPr>
-          <w:b/>
-          <w:bCs/>
-        </w:rPr>
-        <w:t xml:space="preserve">credenciales caducan</w:t>
-      </w:r>
-      <w:r>
-        <w:t xml:space="preserve"> </w:t>
-      </w:r>
-      <w:r>
-        <w:t xml:space="preserve">y hay que refrescarlas. De hecho,</w:t>
-      </w:r>
-      <w:r>
-        <w:t xml:space="preserve"> </w:t>
-      </w:r>
-      <w:r>
-        <w:t xml:space="preserve">a uno de nosotros se le agotaron los créditos y continuamos en otra cuenta de Learner Lab.</w:t>
-      </w:r>
-      <w:r>
-        <w:t xml:space="preserve"> </w:t>
-      </w:r>
-      <w:r>
-        <w:t xml:space="preserve">Todos estos problemas los diagnosticamos</w:t>
-      </w:r>
-      <w:r>
-        <w:t xml:space="preserve"> </w:t>
-      </w:r>
-      <w:r>
-        <w:rPr>
-          <w:b/>
-          <w:bCs/>
-        </w:rPr>
-        <w:t xml:space="preserve">leyendo los logs</w:t>
-      </w:r>
-      <w:r>
-        <w:t xml:space="preserve">, no adivinando."</w:t>
-      </w:r>
-    </w:p>
-    <w:p>
-      <w:r>
-        <w:pict>
-          <v:rect style="width:0;height:1.5pt" o:hralign="center" o:hrstd="t" o:hr="t"/>
-        </w:pict>
-      </w:r>
-    </w:p>
-    <w:bookmarkEnd w:id="17"/>
-    <w:bookmarkStart w:id="18" w:name="X05fab129f06291ffb5cf9fd5d8b8d990ac4e490"/>
-    <w:p>
-      <w:pPr>
-        <w:pStyle w:val="Heading3"/>
-      </w:pPr>
-      <w:r>
-        <w:t xml:space="preserve">Segmento 9 — Conclusión y proyección · ~45 s</w:t>
-      </w:r>
-    </w:p>
-    <w:p>
-      <w:pPr>
-        <w:pStyle w:val="FirstParagraph"/>
-      </w:pPr>
-      <w:r>
-        <w:t xml:space="preserve">🖥️ Diapositiva de cierre / diagrama de arquitectura.</w:t>
-      </w:r>
-      <w:r>
-        <w:t xml:space="preserve"> </w:t>
-      </w:r>
-      <w:r>
-        <w:t xml:space="preserve">🎙️ "En resumen, logramos una aplicación</w:t>
-      </w:r>
-      <w:r>
-        <w:t xml:space="preserve"> </w:t>
-      </w:r>
-      <w:r>
-        <w:rPr>
-          <w:b/>
-          <w:bCs/>
-        </w:rPr>
-        <w:t xml:space="preserve">orquestada, escalable, tolerante a fallos y con</w:t>
-      </w:r>
-      <w:r>
-        <w:rPr>
-          <w:b/>
-          <w:bCs/>
-        </w:rPr>
-        <w:t xml:space="preserve"> </w:t>
-      </w:r>
-      <w:r>
-        <w:rPr>
-          <w:b/>
-          <w:bCs/>
-        </w:rPr>
-        <w:t xml:space="preserve">despliegue automático</w:t>
-      </w:r>
-      <w:r>
-        <w:t xml:space="preserve">. Si esto fuera a producción real para Innovatech Chile, separaríamos los</w:t>
-      </w:r>
-      <w:r>
-        <w:t xml:space="preserve"> </w:t>
-      </w:r>
-      <w:r>
-        <w:t xml:space="preserve">roles de IAM con privilegio mínimo, moveríamos la base de datos a</w:t>
-      </w:r>
-      <w:r>
-        <w:t xml:space="preserve"> </w:t>
-      </w:r>
-      <w:r>
-        <w:rPr>
-          <w:b/>
-          <w:bCs/>
-        </w:rPr>
-        <w:t xml:space="preserve">Amazon RDS</w:t>
-      </w:r>
-      <w:r>
-        <w:t xml:space="preserve">, pondríamos</w:t>
-      </w:r>
-      <w:r>
-        <w:t xml:space="preserve"> </w:t>
-      </w:r>
-      <w:r>
-        <w:rPr>
-          <w:b/>
-          <w:bCs/>
-        </w:rPr>
-        <w:t xml:space="preserve">HTTPS</w:t>
-      </w:r>
-      <w:r>
-        <w:t xml:space="preserve"> </w:t>
-      </w:r>
-      <w:r>
-        <w:t xml:space="preserve">con un dominio propio, y usaríamos autenticación por</w:t>
-      </w:r>
-      <w:r>
-        <w:t xml:space="preserve"> </w:t>
-      </w:r>
-      <w:r>
-        <w:rPr>
-          <w:b/>
-          <w:bCs/>
-        </w:rPr>
-        <w:t xml:space="preserve">OIDC</w:t>
-      </w:r>
-      <w:r>
-        <w:t xml:space="preserve"> </w:t>
-      </w:r>
-      <w:r>
-        <w:t xml:space="preserve">entre GitHub y AWS en vez</w:t>
-      </w:r>
-      <w:r>
-        <w:t xml:space="preserve"> </w:t>
-      </w:r>
-      <w:r>
-        <w:t xml:space="preserve">de claves que caducan. Eso es todo, ¡gracias!"</w:t>
-      </w:r>
-    </w:p>
-    <w:p>
-      <w:r>
-        <w:pict>
-          <v:rect style="width:0;height:1.5pt" o:hralign="center" o:hrstd="t" o:hr="t"/>
-        </w:pict>
-      </w:r>
-    </w:p>
-    <w:bookmarkEnd w:id="18"/>
-    <w:bookmarkEnd w:id="19"/>
-    <w:bookmarkStart w:id="20" w:name="checklist-antes-de-grabar"/>
-    <w:p>
-      <w:pPr>
-        <w:pStyle w:val="Heading2"/>
-      </w:pPr>
-      <w:r>
-        <w:t xml:space="preserve">Checklist antes de grabar</w:t>
+        <w:t xml:space="preserve">docs/evidencias/</w:t>
+      </w:r>
+      <w:r>
+        <w:t xml:space="preserve">).</w:t>
       </w:r>
     </w:p>
     <w:p>
@@ -2252,19 +1637,7 @@
         </w:numPr>
       </w:pPr>
       <w:r>
-        <w:t xml:space="preserve">Tener abiertas las pestañas/capturas en orden (carpeta</w:t>
-      </w:r>
-      <w:r>
-        <w:t xml:space="preserve"> </w:t>
-      </w:r>
-      <w:r>
-        <w:rPr>
-          <w:rStyle w:val="VerbatimChar"/>
-        </w:rPr>
-        <w:t xml:space="preserve">docs/evidencias/</w:t>
-      </w:r>
-      <w:r>
-        <w:t xml:space="preserve">).</w:t>
+        <w:t xml:space="preserve">Probar micrófono (graba 10 s de prueba).</w:t>
       </w:r>
     </w:p>
     <w:p>
@@ -2276,7 +1649,7 @@
         </w:numPr>
       </w:pPr>
       <w:r>
-        <w:t xml:space="preserve">Probar el micrófono y grabar 10 s de prueba.</w:t>
+        <w:t xml:space="preserve">Hablar pausado; usar el guion como apoyo, no leerlo textual.</w:t>
       </w:r>
     </w:p>
     <w:p>
@@ -2288,7 +1661,7 @@
         </w:numPr>
       </w:pPr>
       <w:r>
-        <w:t xml:space="preserve">Hablar pausado; no leer de corrido (usa este guion como apoyo, no palabra por palabra).</w:t>
+        <w:t xml:space="preserve">Exportar en 1080p y revisar que se lea el texto de las capturas.</w:t>
       </w:r>
     </w:p>
     <w:p>
@@ -2300,31 +1673,7 @@
         </w:numPr>
       </w:pPr>
       <w:r>
-        <w:t xml:space="preserve">Si es individual, cada uno graba su propia versión cubriendo TODOS los segmentos.</w:t>
-      </w:r>
-    </w:p>
-    <w:p>
-      <w:pPr>
-        <w:pStyle w:val="Compact"/>
-        <w:numPr>
-          <w:ilvl w:val="0"/>
-          <w:numId w:val="1006"/>
-        </w:numPr>
-      </w:pPr>
-      <w:r>
-        <w:t xml:space="preserve">Exportar en 1080p y revisar que se lea el texto de las capturas.</w:t>
-      </w:r>
-    </w:p>
-    <w:p>
-      <w:pPr>
-        <w:pStyle w:val="Compact"/>
-        <w:numPr>
-          <w:ilvl w:val="0"/>
-          <w:numId w:val="1007"/>
-        </w:numPr>
-      </w:pPr>
-      <w:r>
-        <w:t xml:space="preserve">Subir a AVA dentro del plazo (o el formato que indique el profesor).</w:t>
+        <w:t xml:space="preserve">Subir a AVA dentro del plazo.</w:t>
       </w:r>
     </w:p>
     <w:bookmarkEnd w:id="20"/>
@@ -2466,22 +1815,13 @@
               <w:rPr>
                 <w:rStyle w:val="VerbatimChar"/>
               </w:rPr>
-              <w:t xml:space="preserve">ie1-sg-ecs.png</w:t>
+              <w:t xml:space="preserve">img08</w:t>
             </w:r>
             <w:r>
               <w:t xml:space="preserve"> </w:t>
             </w:r>
             <w:r>
-              <w:t xml:space="preserve">/</w:t>
-            </w:r>
-            <w:r>
-              <w:t xml:space="preserve"> </w:t>
-            </w:r>
-            <w:r>
-              <w:rPr>
-                <w:rStyle w:val="VerbatimChar"/>
-              </w:rPr>
-              <w:t xml:space="preserve">ie1-sg-alb.png</w:t>
+              <w:t xml:space="preserve">(balanceadores)</w:t>
             </w:r>
           </w:p>
         </w:tc>
@@ -2535,7 +1875,22 @@
               <w:rPr>
                 <w:rStyle w:val="VerbatimChar"/>
               </w:rPr>
-              <w:t xml:space="preserve">ie2-target-group.png</w:t>
+              <w:t xml:space="preserve">ie1-sg-ecs.png</w:t>
+            </w:r>
+            <w:r>
+              <w:t xml:space="preserve"> </w:t>
+            </w:r>
+            <w:r>
+              <w:t xml:space="preserve">/</w:t>
+            </w:r>
+            <w:r>
+              <w:t xml:space="preserve"> </w:t>
+            </w:r>
+            <w:r>
+              <w:rPr>
+                <w:rStyle w:val="VerbatimChar"/>
+              </w:rPr>
+              <w:t xml:space="preserve">ie1-sg-alb.png</w:t>
             </w:r>
           </w:p>
         </w:tc>
@@ -2546,7 +1901,7 @@
               <w:pStyle w:val="Compact"/>
             </w:pPr>
             <w:r>
-              <w:t xml:space="preserve">7</w:t>
+              <w:t xml:space="preserve">3</w:t>
             </w:r>
           </w:p>
         </w:tc>
@@ -2719,33 +2074,6 @@
                 <w:rStyle w:val="VerbatimChar"/>
               </w:rPr>
               <w:t xml:space="preserve">ie6-cloudwatch-logs.png</w:t>
-            </w:r>
-          </w:p>
-        </w:tc>
-        <w:tc>
-          <w:tcPr/>
-          <w:p>
-            <w:pPr>
-              <w:pStyle w:val="Compact"/>
-            </w:pPr>
-            <w:r>
-              <w:t xml:space="preserve">7</w:t>
-            </w:r>
-          </w:p>
-        </w:tc>
-      </w:tr>
-      <w:tr>
-        <w:tc>
-          <w:tcPr/>
-          <w:p>
-            <w:pPr>
-              <w:pStyle w:val="Compact"/>
-            </w:pPr>
-            <w:r>
-              <w:rPr>
-                <w:rStyle w:val="VerbatimChar"/>
-              </w:rPr>
-              <w:t xml:space="preserve">ie7-eventos-steady.png</w:t>
             </w:r>
           </w:p>
         </w:tc>
@@ -2874,109 +2202,6 @@
       </w:pPr>
     </w:lvl>
   </w:abstractNum>
-  <w:abstractNum w:abstractNumId="991">
-    <w:nsid w:val="0000A991"/>
-    <w:multiLevelType w:val="multilevel"/>
-    <w:lvl w:ilvl="0">
-      <w:numFmt w:val="bullet"/>
-      <w:lvlText w:val=""/>
-      <w:lvlJc w:val="left"/>
-      <w:pPr>
-        <w:ind w:left="720" w:hanging="360"/>
-      </w:pPr>
-      <w:rPr>
-        <w:rFonts w:ascii="Symbol" w:hAnsi="Symbol" w:cs="Symbol" w:hint="default"/>
-      </w:rPr>
-    </w:lvl>
-    <w:lvl w:ilvl="1">
-      <w:numFmt w:val="bullet"/>
-      <w:lvlText w:val="o"/>
-      <w:lvlJc w:val="left"/>
-      <w:pPr>
-        <w:ind w:left="1440" w:hanging="360"/>
-      </w:pPr>
-      <w:rPr>
-        <w:rFonts w:ascii="Courier New" w:hAnsi="Courier New" w:cs="Courier New" w:hint="default"/>
-      </w:rPr>
-    </w:lvl>
-    <w:lvl w:ilvl="2">
-      <w:numFmt w:val="bullet"/>
-      <w:lvlText w:val=""/>
-      <w:lvlJc w:val="left"/>
-      <w:pPr>
-        <w:ind w:left="2160" w:hanging="360"/>
-      </w:pPr>
-      <w:rPr>
-        <w:rFonts w:ascii="Wingdings" w:hAnsi="Wingdings" w:cs="Wingdings" w:hint="default"/>
-      </w:rPr>
-    </w:lvl>
-    <w:lvl w:ilvl="3">
-      <w:numFmt w:val="bullet"/>
-      <w:lvlText w:val=""/>
-      <w:lvlJc w:val="left"/>
-      <w:pPr>
-        <w:ind w:left="2880" w:hanging="360"/>
-      </w:pPr>
-      <w:rPr>
-        <w:rFonts w:ascii="Symbol" w:hAnsi="Symbol" w:cs="Symbol" w:hint="default"/>
-      </w:rPr>
-    </w:lvl>
-    <w:lvl w:ilvl="4">
-      <w:numFmt w:val="bullet"/>
-      <w:lvlText w:val="o"/>
-      <w:lvlJc w:val="left"/>
-      <w:pPr>
-        <w:ind w:left="3600" w:hanging="360"/>
-      </w:pPr>
-      <w:rPr>
-        <w:rFonts w:ascii="Courier New" w:hAnsi="Courier New" w:cs="Courier New" w:hint="default"/>
-      </w:rPr>
-    </w:lvl>
-    <w:lvl w:ilvl="5">
-      <w:numFmt w:val="bullet"/>
-      <w:lvlText w:val=""/>
-      <w:lvlJc w:val="left"/>
-      <w:pPr>
-        <w:ind w:left="4320" w:hanging="360"/>
-      </w:pPr>
-      <w:rPr>
-        <w:rFonts w:ascii="Wingdings" w:hAnsi="Wingdings" w:cs="Wingdings" w:hint="default"/>
-      </w:rPr>
-    </w:lvl>
-    <w:lvl w:ilvl="6">
-      <w:numFmt w:val="bullet"/>
-      <w:lvlText w:val=""/>
-      <w:lvlJc w:val="left"/>
-      <w:pPr>
-        <w:ind w:left="5040" w:hanging="360"/>
-      </w:pPr>
-      <w:rPr>
-        <w:rFonts w:ascii="Symbol" w:hAnsi="Symbol" w:cs="Symbol" w:hint="default"/>
-      </w:rPr>
-    </w:lvl>
-    <w:lvl w:ilvl="7">
-      <w:numFmt w:val="bullet"/>
-      <w:lvlText w:val="o"/>
-      <w:lvlJc w:val="left"/>
-      <w:pPr>
-        <w:ind w:left="5760" w:hanging="360"/>
-      </w:pPr>
-      <w:rPr>
-        <w:rFonts w:ascii="Courier New" w:hAnsi="Courier New" w:cs="Courier New" w:hint="default"/>
-      </w:rPr>
-    </w:lvl>
-    <w:lvl w:ilvl="8">
-      <w:numFmt w:val="bullet"/>
-      <w:lvlText w:val=""/>
-      <w:lvlJc w:val="left"/>
-      <w:pPr>
-        <w:ind w:left="6480" w:hanging="360"/>
-      </w:pPr>
-      <w:rPr>
-        <w:rFonts w:ascii="Wingdings" w:hAnsi="Wingdings" w:cs="Wingdings" w:hint="default"/>
-      </w:rPr>
-    </w:lvl>
-  </w:abstractNum>
   <w:abstractNum w:abstractNumId="992">
     <w:nsid w:val="0000A992"/>
     <w:multiLevelType w:val="multilevel"/>
@@ -3057,7 +2282,7 @@
     <w:abstractNumId w:val="990"/>
   </w:num>
   <w:num w:numId="1001">
-    <w:abstractNumId w:val="991"/>
+    <w:abstractNumId w:val="992"/>
   </w:num>
   <w:num w:numId="1002">
     <w:abstractNumId w:val="992"/>
@@ -3069,12 +2294,6 @@
     <w:abstractNumId w:val="992"/>
   </w:num>
   <w:num w:numId="1005">
-    <w:abstractNumId w:val="992"/>
-  </w:num>
-  <w:num w:numId="1006">
-    <w:abstractNumId w:val="992"/>
-  </w:num>
-  <w:num w:numId="1007">
     <w:abstractNumId w:val="992"/>
   </w:num>
 </w:numbering>

</xml_diff>